<commit_message>
docs: record the last three findings in the execution guide
Adds to Section 27:
- The ConfigMap that never reached the pods, and why ArgoCD reported Synced the
  whole time.
- yamllint rejecting the exact file `kustomize edit set image` rewrites, which
  meant every release broke the next pipeline's yaml-lint.
- detect-secrets flagging the image tag, and why baselining it does not work
  when CI replaces the SHA on every build.

Co-Authored-By: Claude Opus 5 <noreply@anthropic.com>
</commit_message>
<xml_diff>
--- a/GUIA_EJECUCION_PROYECTO 610.docx
+++ b/GUIA_EJECUCION_PROYECTO 610.docx
@@ -6677,6 +6677,45 @@
         <w:pStyle w:val="ListBullet"/>
       </w:pPr>
       <w:r>
+        <w:t>Cambiar el ConfigMap no llegaba a los pods (ArgoCD decia Synced igualmente)</w:t>
+      </w:r>
+    </w:p>
+    <w:p>
+      <w:r>
+        <w:t>mlops-config era un ConfigMap normal consumido con envFrom. Kubernetes lee esos valores UNA vez, al arrancar el pod, y modificar un ConfigMap no reinicia nada: cada cambio de DB_HOST, S3_BUCKET_NAME, MODEL_REGISTRY_ALIAS o MLFLOW_ALLOWED_HOSTS se aplicaba, aparecia en `kubectl get cm`, y NUNCA llegaba a los contenedores. ArgoCD reportaba Synced todo el tiempo, porque para el el cluster si coincidia con Git. Se detecto al anadir el hostname del ELB a MLFLOW_ALLOWED_HOSTS: sincronizo bien y MLflow siguio corriendo con la lista vieja. Corregido con un configMapGenerator de kustomize, cuyo nombre lleva un hash del contenido: al cambiar un valor cambia el nombre del ConfigMap, kustomize reescribe las referencias envFrom, cambia el spec del Deployment y Kubernetes hace un rolling update normal. Los valores viven ahora en kubernetes/base/mlops-config.env y kubernetes/overlays/production/mlops-config.env.</w:t>
+      </w:r>
+    </w:p>
+    <w:p>
+      <w:pPr>
+        <w:pStyle w:val="ListBullet"/>
+      </w:pPr>
+      <w:r>
+        <w:t>yamllint rechazaba el fichero que el propio CI reescribe</w:t>
+      </w:r>
+    </w:p>
+    <w:p>
+      <w:r>
+        <w:t>`kustomize edit set image` (job gitops-release) escribe las secuencias de bloque SIN indentar bajo su clave, y el valor por defecto de yamllint (indent-sequences: true) lo considera error. Es decir, cada release rompia el yaml-lint del pipeline SIGUIENTE; solo pasaba desapercibido porque cada pipeline se ejecuta sobre el commit anterior a esa reescritura. Corregido poniendo indent-sequences: whatever en .yamllint.yml: el formato de ese fichero lo decide una herramienta, no una persona.</w:t>
+      </w:r>
+    </w:p>
+    <w:p>
+      <w:pPr>
+        <w:pStyle w:val="ListBullet"/>
+      </w:pPr>
+      <w:r>
+        <w:t>detect-secrets bloqueaba los commits por el tag de imagen</w:t>
+      </w:r>
+    </w:p>
+    <w:p>
+      <w:r>
+        <w:t>El tag es el SHA de git (40 caracteres hex) y el detector de cadenas hex de alta entropia lo marca como posible secreto. Meterlo en el baseline no sirve: gitops-release lo reemplaza por un SHA distinto en cada build y el commit siguiente volveria a bloquearse. Se excluyen las lineas `newTag:` en .pre-commit-config.yaml; un tag de imagen nunca es una credencial.</w:t>
+      </w:r>
+    </w:p>
+    <w:p>
+      <w:pPr>
+        <w:pStyle w:val="ListBullet"/>
+      </w:pPr>
+      <w:r>
         <w:t>make train-toy fallaba en Windows con exit code 1 pese a entrenar bien</w:t>
       </w:r>
     </w:p>

</xml_diff>

<commit_message>
docs: record the deploy-kills-the-API bug in the execution guide
The most consequential finding of the whole run, so Section 27 now leads with
it: the API loaded its model once at startup, ArgoCD restarts api and mlflow
together, and a startup that lost that race left the replica answering 503
permanently while /health kept reporting 200. Includes the two-part fix
(background retry loop plus a /ready endpoint distinct from /health) and the
way to reproduce and verify it.

Co-Authored-By: Claude Opus 5 <noreply@anthropic.com>
</commit_message>
<xml_diff>
--- a/GUIA_EJECUCION_PROYECTO 610.docx
+++ b/GUIA_EJECUCION_PROYECTO 610.docx
@@ -6690,6 +6690,19 @@
         <w:pStyle w:val="ListBullet"/>
       </w:pPr>
       <w:r>
+        <w:t>CRITICO: cada despliegue dejaba la API muerta - servia 503 para siempre</w:t>
+      </w:r>
+    </w:p>
+    <w:p>
+      <w:r>
+        <w:t>El sintoma: tras un release rutinario, las DOS replicas de la API respondian model_loaded=false y /predict devolvia 503 de forma permanente, pese a que el modelo estaba correctamente registrado y aliaseado en MLflow. La causa: la API cargaba el modelo UNA sola vez, en un hook de startup. ArgoCD reinicia los Deployments de api y mlflow a la vez, asi que la API arrancaba mientras el servidor de tracking todavia no aceptaba conexiones, agotaba sus tres reintentos y se quedaba sin modelo. Y como /health devolvia 200 igualmente, Kubernetes veia un pod sano, lo mantenia en el Service y no lo reiniciaba nunca: habia que reiniciarlo a mano despues de CADA despliegue. Se corrigio con dos cambios: (1) una tarea en segundo plano que sigue reintentando la carga mientras no haya modelo, de modo que un registry lento se resuelve solo; y (2) un endpoint /ready nuevo, que devuelve 503 hasta que hay modelo y es el que usa ahora el readinessProbe, para que una replica que no puede servir predicciones quede fuera del Service. /health sigue en 200 sin modelo y sigue siendo el objetivo del livenessProbe: matar el contenedor solo reiniciaria el bucle de reintentos desde cero. Verificacion: levantar la API sin MLflow accesible (/ready da 503), luego arrancar MLflow y entrenar; /ready pasa a 200 solo, y el contador de reinicios del contenedor sigue en 0.</w:t>
+      </w:r>
+    </w:p>
+    <w:p>
+      <w:pPr>
+        <w:pStyle w:val="ListBullet"/>
+      </w:pPr>
+      <w:r>
         <w:t>yamllint rechazaba el fichero que el propio CI reescribe</w:t>
       </w:r>
     </w:p>

</xml_diff>

<commit_message>
fix(ci): wait for the dind daemon before docker build in build-push-ecr
docker:24.0.5-dind opens its TCP port before dockerd finishes initializing.
`docker login` doesn't need a live local daemon (it only talks to the
registry over the network) so it succeeded, but the `docker build` right
after it hit the daemon before it was actually ready and failed with "Cannot
connect to the Docker daemon at tcp://docker:2375" - a startup race, not a
privileged-mode or credentials issue. integration-tests uses the same dind
service without hitting this because its poetry install gives the daemon
time to finish before testcontainers touches it.

Added the standard wait-for-daemon retry loop before the first `docker`
command in build-push-ecr.

Co-Authored-By: Claude Sonnet 5 <noreply@anthropic.com>
</commit_message>
<xml_diff>
--- a/GUIA_EJECUCION_PROYECTO 610.docx
+++ b/GUIA_EJECUCION_PROYECTO 610.docx
@@ -7142,6 +7142,34 @@
         <w:t>A diferencia del proveedor OIDC, esto no era un recurso compartido legítimo: cada proyecto necesita su PROPIO rol, con su propia condición de confianza (`gitlab_project_path` distinto), pero ambos habían usado el mismo nombre literal "GitLabCIRole" sin prefijo, y los nombres de rol IAM son únicos por cuenta. `terraform apply` falló con EntityAlreadyExists apuntando al rol del otro proyecto (confirmado con `aws iam get-role`: tags Project=predictive-maintenance-mlops, usado por su pipeline minutos antes). Corregido renombrando el recurso a "${var.project_name}-gitlab-ci" (="hotel-mlops-gitlab-ci"), igual que el resto de roles de este proyecto (mlflow-irsa, api-irsa, ...), y añadiendo un output `gitlab_ci_role_arn` para dejar de tener que buscarlo a mano con `aws iam get-role` (ver Sección 11). .gitlab-ci.yml actualizado con el ARN real. Lección general para cualquier cuenta AWS compartida entre proyectos: todo nombre de recurso IAM debe llevar el prefijo del proyecto, sin excepciones - un solo nombre sin prefijo es suficiente para bloquear un despliegue completo.</w:t>
       </w:r>
     </w:p>
+    <w:p>
+      <w:pPr>
+        <w:pStyle w:val="ListBullet"/>
+      </w:pPr>
+      <w:r>
+        <w:t>El runner local ya corriendo pertenecía al docker-compose del OTRO proyecto, no al de este</w:t>
+      </w:r>
+    </w:p>
+    <w:p>
+      <w:pPr/>
+      <w:r>
+        <w:t>El pipeline se disparó correctamente pero los 4 jobs de la etapa test quedaron 'pending' más de 80 minutos pese a que el contenedor `gitlab-runner` estaba activo y online. La API de GitLab (`GET /runners/:id`) reveló la causa: ese runner solo tenía asignado el proyecto predictive-maintenance-mlops - un registro anterior ('55663509') que sí apuntaba a este proyecto ya no existía (borrado en algún momento). El contenedor en sí tampoco era de este repositorio: `docker inspect` mostró que montaba el volumen `runner_gitlab-runner-config`, es decir, fue levantado por el docker-compose del otro proyecto (nombre de proyecto 'runner'), no por el de aquí. Corregido creando un runner de proyecto nuevo vía API (`POST /user/runners`, scope `create_runner` del PAT - evita depender de la UI) y levantando el servicio `gitlab-runner` de ESTE docker-compose.yml con `make runner-start` / `docker compose --profile ci-local up -d gitlab-runner`, que crea su propio contenedor (`610-hotel-booking-mlops-gitlab-runner-1`) con su propio volumen con nombre calificado por el directorio del proyecto - aislado del runner del otro proyecto, sin volúmenes ni contenedores compartidos. Lección: en una máquina con más de un proyecto usando `docker compose --profile ci-local`, comprobar SIEMPRE con `docker inspect &lt;container&gt; --format '{{.Mounts}}'` que el runner que ves corriendo es realmente el tuyo antes de asumir que un push simplemente tardará.</w:t>
+      </w:r>
+    </w:p>
+    <w:p>
+      <w:pPr>
+        <w:pStyle w:val="ListBullet"/>
+      </w:pPr>
+      <w:r>
+        <w:t>build-push-ecr fallaba con 'Cannot connect to the Docker daemon at tcp://docker:2375'</w:t>
+      </w:r>
+    </w:p>
+    <w:p>
+      <w:pPr/>
+      <w:r>
+        <w:t>El servicio docker:24.0.5-dind abre su puerto TCP antes de que dockerd termine de inicializar. `docker login` no necesita un daemon local vivo (solo habla con el registry por red), así que 'Login Succeeded' aparecía igual, pero el `docker build` inmediatamente posterior sí lo necesita y fallaba con exit code 1 - una condición de carrera de arranque, no un problema de --privileged (ya estaba activo) ni de credenciales. integration-tests usa el mismo servicio dind y nunca lo sufrió porque su `poetry install` de por medio le da al daemon varios segundos de margen antes de que testcontainers lo use. Corregido en .gitlab-ci.yml con una espera activa estándar antes de `docker login`/`docker build`: `for i in $(seq 1 30); do docker info &gt;/dev/null 2&gt;&amp;1 &amp;&amp; break; sleep 1; done` - el patrón recomendado por la propia documentación de GitLab/Docker para servicios dind, no un sleep fijo a ciegas.</w:t>
+      </w:r>
+    </w:p>
     <w:sectPr>
       <w:pgSz w:w="12240" w:h="15840"/>
       <w:pgMar w:top="1134" w:right="1247" w:bottom="1134" w:left="1247" w:header="720" w:footer="720" w:gutter="0"/>

</xml_diff>

<commit_message>
feat(monitoring): add drift detection pipeline (data/prediction/confidence/concept)
Adds the drift monitor as a daily Kubernetes CronJob: PSI and Jensen-Shannon
for data/prediction drift, a confidence signal from held-out predict_proba,
and true concept drift (P(y|X)) via weighted F1 with bootstrap CI against
reconciled booking labels. Verdict is detect-only by design — it records
an MLflow run and exits non-zero on ALERT; retraining stays a human call.

Wires api/monitoring.py, the reference-profile artifact logged at training
time, replay_bookings.py for backtesting, and the corresponding test suites
(unit + integration schema check).

Co-Authored-By: Claude Sonnet 5 <noreply@anthropic.com>
</commit_message>
<xml_diff>
--- a/GUIA_EJECUCION_PROYECTO 610.docx
+++ b/GUIA_EJECUCION_PROYECTO 610.docx
@@ -354,6 +354,83 @@
           <w:sz w:val="21"/>
         </w:rPr>
         <w:t>23. Notas y solución de problemas conocidos</w:t>
+      </w:r>
+    </w:p>
+    <w:p>
+      <w:pPr>
+        <w:spacing w:after="60"/>
+      </w:pPr>
+      <w:r>
+        <w:rPr>
+          <w:sz w:val="21"/>
+        </w:rPr>
+        <w:t>24. Bootstrap del usuario IAM de automatización (IaC, sin usar la root key)</w:t>
+      </w:r>
+    </w:p>
+    <w:p>
+      <w:pPr>
+        <w:spacing w:after="60"/>
+      </w:pPr>
+      <w:r>
+        <w:rPr>
+          <w:sz w:val="21"/>
+        </w:rPr>
+        <w:t>25. Registro de cambios de la ejecución real</w:t>
+      </w:r>
+    </w:p>
+    <w:p>
+      <w:pPr>
+        <w:spacing w:after="60"/>
+      </w:pPr>
+      <w:r>
+        <w:rPr>
+          <w:sz w:val="21"/>
+        </w:rPr>
+        <w:t>26. Bootstrap de GitOps: los tres manifiestos y su orden</w:t>
+      </w:r>
+    </w:p>
+    <w:p>
+      <w:pPr>
+        <w:spacing w:after="60"/>
+      </w:pPr>
+      <w:r>
+        <w:rPr>
+          <w:sz w:val="21"/>
+        </w:rPr>
+        <w:t>27. Correcciones encontradas al desplegar en AWS de verdad</w:t>
+      </w:r>
+    </w:p>
+    <w:p>
+      <w:pPr>
+        <w:spacing w:after="60"/>
+      </w:pPr>
+      <w:r>
+        <w:rPr>
+          <w:sz w:val="21"/>
+        </w:rPr>
+        <w:t>28. Segunda ejecución end-to-end real (28/08/2026): cuenta AWS compartida</w:t>
+      </w:r>
+    </w:p>
+    <w:p>
+      <w:pPr>
+        <w:spacing w:after="60"/>
+      </w:pPr>
+      <w:r>
+        <w:rPr>
+          <w:sz w:val="21"/>
+        </w:rPr>
+        <w:t>29. El bucle de monitoreo de drift (local y en producción)</w:t>
+      </w:r>
+    </w:p>
+    <w:p>
+      <w:pPr>
+        <w:spacing w:after="60"/>
+      </w:pPr>
+      <w:r>
+        <w:rPr>
+          <w:sz w:val="21"/>
+        </w:rPr>
+        <w:t>30. Tercera iteración (30/08/2026): el bucle de monitoreo, de punta a punta</w:t>
       </w:r>
     </w:p>
     <w:p>
@@ -1515,6 +1592,25 @@
     </w:p>
     <w:p>
       <w:pPr>
+        <w:pStyle w:val="ListBullet"/>
+        <w:spacing w:after="80"/>
+        <w:ind w:left="340"/>
+      </w:pPr>
+      <w:r>
+        <w:rPr>
+          <w:sz w:val="22"/>
+        </w:rPr>
+        <w:t xml:space="preserve">☐  </w:t>
+      </w:r>
+      <w:r>
+        <w:rPr>
+          <w:sz w:val="21"/>
+        </w:rPr>
+        <w:t>Aparece también `reference_profile_logged`: es la línea base de monitoreo (histogramas de features, mezcla del target, F1/confianza sobre el conjunto retenido) que el entrenamiento registra como artefacto `monitoring/reference_profile.json` del propio run. Sin ella el modelo no es monitoreable — ver Sección 29.</w:t>
+      </w:r>
+    </w:p>
+    <w:p>
+      <w:pPr>
         <w:spacing w:after="120"/>
       </w:pPr>
       <w:r>
@@ -1766,12 +1862,8 @@
             <w:tcW w:type="dxa" w:w="4873"/>
           </w:tcPr>
           <w:p>
-            <w:r/>
             <w:r>
-              <w:rPr>
-                <w:sz w:val="18"/>
-              </w:rPr>
-              <w:t>http://localhost:5000</w:t>
+              <w:t>http://localhost:5050</w:t>
             </w:r>
           </w:p>
         </w:tc>
@@ -1856,12 +1948,8 @@
             <w:tcW w:type="dxa" w:w="4873"/>
           </w:tcPr>
           <w:p>
-            <w:r/>
             <w:r>
-              <w:rPr>
-                <w:sz w:val="18"/>
-              </w:rPr>
-              <w:t>localhost:9092</w:t>
+              <w:t>localhost:19092</w:t>
             </w:r>
           </w:p>
         </w:tc>
@@ -1888,7 +1976,7 @@
         <w:rPr>
           <w:sz w:val="21"/>
         </w:rPr>
-        <w:t>http://localhost:8000/health responde 200 con `model_loaded: true` (si es `false`, primero hay que entrenar y promover un modelo a `staging` con MLFLOW_TRACKING_URI=http://localhost:5000; ver Sección 3, `make train`).</w:t>
+        <w:t>http://localhost:8000/health responde 200 con `model_loaded: true` (si es `false`, primero hay que entrenar y promover un modelo a `staging` con MLFLOW_TRACKING_URI=http://localhost:5050; ver Sección 3, `make train`).</w:t>
       </w:r>
     </w:p>
     <w:p>
@@ -1986,7 +2074,7 @@
           <w:color w:val="1A1A1A"/>
           <w:sz w:val="19"/>
         </w:rPr>
-        <w:t xml:space="preserve">    "hotel": "Resort Hotel", "lead_time": 10, "adults": 2, "meal": "BB",</w:t>
+        <w:t xml:space="preserve">    "hotel": "Resort Hotel", "lead_time": 10,</w:t>
       </w:r>
     </w:p>
     <w:p>
@@ -2001,7 +2089,7 @@
           <w:color w:val="1A1A1A"/>
           <w:sz w:val="19"/>
         </w:rPr>
-        <w:t xml:space="preserve">    "country": "PRT", "distribution_channel": "Direct",</w:t>
+        <w:t xml:space="preserve">    "arrival_date_year": 2017, "arrival_date_week_number": 27,</w:t>
       </w:r>
     </w:p>
     <w:p>
@@ -2016,7 +2104,7 @@
           <w:color w:val="1A1A1A"/>
           <w:sz w:val="19"/>
         </w:rPr>
-        <w:t xml:space="preserve">    "reserved_room_type": "A", "assigned_room_type": "A",</w:t>
+        <w:t xml:space="preserve">    "arrival_date_day_of_month": 1,</w:t>
       </w:r>
     </w:p>
     <w:p>
@@ -2031,7 +2119,7 @@
           <w:color w:val="1A1A1A"/>
           <w:sz w:val="19"/>
         </w:rPr>
-        <w:t xml:space="preserve">    "customer_type": "Transient", "adr": 98.0, "month": 7</w:t>
+        <w:t xml:space="preserve">    "stays_in_weekend_nights": 0, "stays_in_week_nights": 3,</w:t>
       </w:r>
     </w:p>
     <w:p>
@@ -2046,7 +2134,120 @@
           <w:color w:val="1A1A1A"/>
           <w:sz w:val="19"/>
         </w:rPr>
+        <w:t xml:space="preserve">    "adults": 2, "meal": "BB", "country": "PRT",</w:t>
+      </w:r>
+    </w:p>
+    <w:p>
+      <w:pPr>
+        <w:spacing w:after="0" w:before="0"/>
+        <w:ind w:left="170"/>
+        <w:shd w:val="clear" w:color="auto" w:fill="EDEFF2"/>
+      </w:pPr>
+      <w:r>
+        <w:rPr>
+          <w:rFonts w:ascii="Consolas" w:hAnsi="Consolas"/>
+          <w:color w:val="1A1A1A"/>
+          <w:sz w:val="19"/>
+        </w:rPr>
+        <w:t xml:space="preserve">    "distribution_channel": "Direct",</w:t>
+      </w:r>
+    </w:p>
+    <w:p>
+      <w:pPr>
+        <w:spacing w:after="0" w:before="0"/>
+        <w:ind w:left="170"/>
+        <w:shd w:val="clear" w:color="auto" w:fill="EDEFF2"/>
+      </w:pPr>
+      <w:r>
+        <w:rPr>
+          <w:rFonts w:ascii="Consolas" w:hAnsi="Consolas"/>
+          <w:color w:val="1A1A1A"/>
+          <w:sz w:val="19"/>
+        </w:rPr>
+        <w:t xml:space="preserve">    "reserved_room_type": "A", "assigned_room_type": "A",</w:t>
+      </w:r>
+    </w:p>
+    <w:p>
+      <w:pPr>
+        <w:spacing w:after="0" w:before="0"/>
+        <w:ind w:left="170"/>
+        <w:shd w:val="clear" w:color="auto" w:fill="EDEFF2"/>
+      </w:pPr>
+      <w:r>
+        <w:rPr>
+          <w:rFonts w:ascii="Consolas" w:hAnsi="Consolas"/>
+          <w:color w:val="1A1A1A"/>
+          <w:sz w:val="19"/>
+        </w:rPr>
+        <w:t xml:space="preserve">    "deposit_type": "No Deposit", "customer_type": "Transient",</w:t>
+      </w:r>
+    </w:p>
+    <w:p>
+      <w:pPr>
+        <w:spacing w:after="0" w:before="0"/>
+        <w:ind w:left="170"/>
+        <w:shd w:val="clear" w:color="auto" w:fill="EDEFF2"/>
+      </w:pPr>
+      <w:r>
+        <w:rPr>
+          <w:rFonts w:ascii="Consolas" w:hAnsi="Consolas"/>
+          <w:color w:val="1A1A1A"/>
+          <w:sz w:val="19"/>
+        </w:rPr>
+        <w:t xml:space="preserve">    "adr": 98.0, "month": 7</w:t>
+      </w:r>
+    </w:p>
+    <w:p>
+      <w:pPr>
+        <w:spacing w:after="0" w:before="0"/>
+        <w:ind w:left="170"/>
+        <w:shd w:val="clear" w:color="auto" w:fill="EDEFF2"/>
+      </w:pPr>
+      <w:r>
+        <w:rPr>
+          <w:rFonts w:ascii="Consolas" w:hAnsi="Consolas"/>
+          <w:color w:val="1A1A1A"/>
+          <w:sz w:val="19"/>
+        </w:rPr>
         <w:t xml:space="preserve">  }'</w:t>
+      </w:r>
+    </w:p>
+    <w:p>
+      <w:pPr>
+        <w:spacing w:after="160"/>
+      </w:pPr>
+    </w:p>
+    <w:p>
+      <w:pPr>
+        <w:spacing w:after="120"/>
+        <w:ind w:left="624"/>
+      </w:pPr>
+      <w:r>
+        <w:rPr>
+          <w:i/>
+          <w:color w:val="555555"/>
+          <w:sz w:val="19"/>
+        </w:rPr>
+        <w:t>El payload lleva los 17 campos obligatorios de api/schemas.py::BookingFeatures. Omitir cualquiera de ellos (arrival_date_year, arrival_date_week_number, arrival_date_day_of_month, stays_in_weekend_nights, stays_in_week_nights y deposit_type son los que más se olvidan) devuelve HTTP 422, no una predicción.</w:t>
+      </w:r>
+    </w:p>
+    <w:p>
+      <w:pPr>
+        <w:pStyle w:val="ListBullet"/>
+        <w:spacing w:after="80"/>
+        <w:ind w:left="340"/>
+      </w:pPr>
+      <w:r>
+        <w:rPr>
+          <w:sz w:val="22"/>
+        </w:rPr>
+        <w:t xml:space="preserve">☐  </w:t>
+      </w:r>
+      <w:r>
+        <w:rPr>
+          <w:sz w:val="21"/>
+        </w:rPr>
+        <w:t>La respuesta trae `predicted_market_segment` y además `prediction_id`, `model_version`, `confidence` y `margin`. El `prediction_id` es la clave con la que luego se envía la verdad a `/feedback` — ver Sección 29.</w:t>
       </w:r>
     </w:p>
     <w:p>
@@ -4153,7 +4354,7 @@
           <w:color w:val="555555"/>
           <w:sz w:val="19"/>
         </w:rPr>
-        <w:t>Reemplazar los dos placeholders `eks.amazonaws.com/role-arn` con los valores reales de `mlflow_iam_role_arn` y `api_iam_role_arn`.</w:t>
+        <w:t>Reemplazar los TRES placeholders `eks.amazonaws.com/role-arn` con los valores reales de `mlflow_iam_role_arn`, `api_iam_role_arn` y `jobs_iam_role_arn` (este último es el de `jobs-sa`, la identidad del CronJob de drift — ver Sección 29).</w:t>
       </w:r>
     </w:p>
     <w:p>
@@ -4165,7 +4366,7 @@
         <w:rPr>
           <w:sz w:val="21"/>
         </w:rPr>
-        <w:t>Editar kubernetes/overlays/production/patch-mlops-config.yaml</w:t>
+        <w:t>Editar kubernetes/overlays/production/mlops-config.env</w:t>
       </w:r>
     </w:p>
     <w:p>
@@ -4179,7 +4380,7 @@
           <w:color w:val="555555"/>
           <w:sz w:val="19"/>
         </w:rPr>
-        <w:t>Reemplazar `DB_HOST` con el valor real de `rds_endpoint` y `S3_BUCKET_NAME` con el valor real de `s3_bucket_name`.</w:t>
+        <w:t>Reemplazar `DB_HOST` con el valor real de `rds_endpoint` y `S3_BUCKET_NAME` con el valor real de `s3_bucket_name`. (El fichero se llamaba patch-mlops-config.yaml en iteraciones anteriores; ahora es un .env que Kustomize renderiza con configMapGenerator, de modo que su hash cambia y el rollout llega a los pods.)</w:t>
       </w:r>
     </w:p>
     <w:p>
@@ -4205,7 +4406,7 @@
           <w:color w:val="555555"/>
           <w:sz w:val="19"/>
         </w:rPr>
-        <w:t>Reemplazar el Account ID de ejemplo (040175285118) en las tres imágenes (hotel-mlops-api, hotel-mlops-dashboard, hotel-mlops-mlflow) por tu &lt;ACCOUNT_ID&gt; real. El tag puede quedar en "latest" por ahora; el primer job gitops-release lo sobreescribirá con el SHA del commit.</w:t>
+        <w:t>Reemplazar el Account ID de ejemplo (040175285118) en las CUATRO imágenes (hotel-mlops-api, hotel-mlops-dashboard, hotel-mlops-mlflow y hotel-mlops-jobs) por tu &lt;ACCOUNT_ID&gt; real. El tag puede quedar en "latest" por ahora; el primer job gitops-release lo sobreescribirá con el SHA del commit.</w:t>
       </w:r>
     </w:p>
     <w:p>
@@ -4680,7 +4881,7 @@
           <w:color w:val="555555"/>
           <w:sz w:val="19"/>
         </w:rPr>
-        <w:t>Usar el ARN real del rol "GitLabCIRole" anotado en la Sección 11 (formato: arn:aws:iam::&lt;ACCOUNT_ID&gt;:role/GitLabCIRole).</w:t>
+        <w:t>Usar el ARN real del rol de CI anotado en la Sección 11. Desde la segunda ejecución el rol lleva el prefijo del proyecto para no colisionar con otro proyecto de la misma cuenta (Sección 28), así que el formato es arn:aws:iam::&lt;ACCOUNT_ID&gt;:role/hotel-mlops-gitlab-ci, no el antiguo GitLabCIRole.</w:t>
       </w:r>
     </w:p>
     <w:p>
@@ -4733,6 +4934,20 @@
           <w:sz w:val="19"/>
         </w:rPr>
         <w:t>Misma línea de `ECR_REGISTRY`, en ese segundo job.</w:t>
+      </w:r>
+    </w:p>
+    <w:p>
+      <w:pPr>
+        <w:spacing w:after="120"/>
+        <w:ind w:left="624"/>
+      </w:pPr>
+      <w:r>
+        <w:rPr>
+          <w:i/>
+          <w:color w:val="555555"/>
+          <w:sz w:val="19"/>
+        </w:rPr>
+        <w:t>No hace falta tocar nada más: `build-push-ecr` construye y sube CUATRO imágenes (api, dashboard, mlflow y jobs, esta última desde Dockerfile.jobs) y `gitops-release` escribe los cuatro tags con `kustomize edit set image`. El repositorio ECR hotel-mlops-jobs lo crea Terraform junto a los otros tres.</w:t>
       </w:r>
     </w:p>
     <w:p>
@@ -5407,7 +5622,7 @@
           <w:color w:val="1A1A1A"/>
           <w:sz w:val="19"/>
         </w:rPr>
-        <w:t xml:space="preserve">    "hotel": "Resort Hotel", "lead_time": 10, "adults": 2, "meal": "BB",</w:t>
+        <w:t xml:space="preserve">    "hotel": "Resort Hotel", "lead_time": 10,</w:t>
       </w:r>
     </w:p>
     <w:p>
@@ -5422,7 +5637,7 @@
           <w:color w:val="1A1A1A"/>
           <w:sz w:val="19"/>
         </w:rPr>
-        <w:t xml:space="preserve">    "country": "PRT", "distribution_channel": "Direct",</w:t>
+        <w:t xml:space="preserve">    "arrival_date_year": 2017, "arrival_date_week_number": 27,</w:t>
       </w:r>
     </w:p>
     <w:p>
@@ -5437,7 +5652,7 @@
           <w:color w:val="1A1A1A"/>
           <w:sz w:val="19"/>
         </w:rPr>
-        <w:t xml:space="preserve">    "reserved_room_type": "A", "assigned_room_type": "A",</w:t>
+        <w:t xml:space="preserve">    "arrival_date_day_of_month": 1,</w:t>
       </w:r>
     </w:p>
     <w:p>
@@ -5452,7 +5667,7 @@
           <w:color w:val="1A1A1A"/>
           <w:sz w:val="19"/>
         </w:rPr>
-        <w:t xml:space="preserve">    "customer_type": "Transient", "adr": 98.0, "month": 7</w:t>
+        <w:t xml:space="preserve">    "stays_in_weekend_nights": 0, "stays_in_week_nights": 3,</w:t>
       </w:r>
     </w:p>
     <w:p>
@@ -5467,6 +5682,81 @@
           <w:color w:val="1A1A1A"/>
           <w:sz w:val="19"/>
         </w:rPr>
+        <w:t xml:space="preserve">    "adults": 2, "meal": "BB", "country": "PRT",</w:t>
+      </w:r>
+    </w:p>
+    <w:p>
+      <w:pPr>
+        <w:spacing w:after="0" w:before="0"/>
+        <w:ind w:left="170"/>
+        <w:shd w:val="clear" w:color="auto" w:fill="EDEFF2"/>
+      </w:pPr>
+      <w:r>
+        <w:rPr>
+          <w:rFonts w:ascii="Consolas" w:hAnsi="Consolas"/>
+          <w:color w:val="1A1A1A"/>
+          <w:sz w:val="19"/>
+        </w:rPr>
+        <w:t xml:space="preserve">    "distribution_channel": "Direct",</w:t>
+      </w:r>
+    </w:p>
+    <w:p>
+      <w:pPr>
+        <w:spacing w:after="0" w:before="0"/>
+        <w:ind w:left="170"/>
+        <w:shd w:val="clear" w:color="auto" w:fill="EDEFF2"/>
+      </w:pPr>
+      <w:r>
+        <w:rPr>
+          <w:rFonts w:ascii="Consolas" w:hAnsi="Consolas"/>
+          <w:color w:val="1A1A1A"/>
+          <w:sz w:val="19"/>
+        </w:rPr>
+        <w:t xml:space="preserve">    "reserved_room_type": "A", "assigned_room_type": "A",</w:t>
+      </w:r>
+    </w:p>
+    <w:p>
+      <w:pPr>
+        <w:spacing w:after="0" w:before="0"/>
+        <w:ind w:left="170"/>
+        <w:shd w:val="clear" w:color="auto" w:fill="EDEFF2"/>
+      </w:pPr>
+      <w:r>
+        <w:rPr>
+          <w:rFonts w:ascii="Consolas" w:hAnsi="Consolas"/>
+          <w:color w:val="1A1A1A"/>
+          <w:sz w:val="19"/>
+        </w:rPr>
+        <w:t xml:space="preserve">    "deposit_type": "No Deposit", "customer_type": "Transient",</w:t>
+      </w:r>
+    </w:p>
+    <w:p>
+      <w:pPr>
+        <w:spacing w:after="0" w:before="0"/>
+        <w:ind w:left="170"/>
+        <w:shd w:val="clear" w:color="auto" w:fill="EDEFF2"/>
+      </w:pPr>
+      <w:r>
+        <w:rPr>
+          <w:rFonts w:ascii="Consolas" w:hAnsi="Consolas"/>
+          <w:color w:val="1A1A1A"/>
+          <w:sz w:val="19"/>
+        </w:rPr>
+        <w:t xml:space="preserve">    "adr": 98.0, "month": 7</w:t>
+      </w:r>
+    </w:p>
+    <w:p>
+      <w:pPr>
+        <w:spacing w:after="0" w:before="0"/>
+        <w:ind w:left="170"/>
+        <w:shd w:val="clear" w:color="auto" w:fill="EDEFF2"/>
+      </w:pPr>
+      <w:r>
+        <w:rPr>
+          <w:rFonts w:ascii="Consolas" w:hAnsi="Consolas"/>
+          <w:color w:val="1A1A1A"/>
+          <w:sz w:val="19"/>
+        </w:rPr>
         <w:t xml:space="preserve">  }'</w:t>
       </w:r>
     </w:p>
@@ -5528,13 +5818,7 @@
         <w:rPr>
           <w:sz w:val="22"/>
         </w:rPr>
-        <w:t xml:space="preserve">☐  </w:t>
-      </w:r>
-      <w:r>
-        <w:rPr>
-          <w:sz w:val="21"/>
-        </w:rPr>
-        <w:t>`/predict` devuelve un `predicted_market_segment` válido.</w:t>
+        <w:t>`/predict` devuelve un `predicted_market_segment` válido, y con él un `prediction_id`, el `model_version` que lo produjo, y `confidence` / `margin`.</w:t>
       </w:r>
     </w:p>
     <w:p>
@@ -5558,6 +5842,44 @@
     </w:p>
     <w:p>
       <w:pPr>
+        <w:pStyle w:val="ListBullet"/>
+        <w:spacing w:after="80"/>
+        <w:ind w:left="340"/>
+      </w:pPr>
+      <w:r>
+        <w:rPr>
+          <w:sz w:val="22"/>
+        </w:rPr>
+        <w:t xml:space="preserve">☐  </w:t>
+      </w:r>
+      <w:r>
+        <w:rPr>
+          <w:sz w:val="21"/>
+        </w:rPr>
+        <w:t>`/health` trae también `model_version` y el bloque `inference_logging` (`enabled`, `queue_depth`, `rows_written`, `rows_dropped`, `circuit_breaker_state`). `enabled: true` y `rows_written` creciendo con el tráfico confirman que el log de predicciones está aterrizando en RDS; `rows_dropped` subiendo es la señal de que el sumidero está degradado y de que el informe de drift se calculará sobre una muestra no representativa.</w:t>
+      </w:r>
+    </w:p>
+    <w:p>
+      <w:pPr>
+        <w:pStyle w:val="ListBullet"/>
+        <w:spacing w:after="80"/>
+        <w:ind w:left="340"/>
+      </w:pPr>
+      <w:r>
+        <w:rPr>
+          <w:sz w:val="22"/>
+        </w:rPr>
+        <w:t xml:space="preserve">☐  </w:t>
+      </w:r>
+      <w:r>
+        <w:rPr>
+          <w:sz w:val="21"/>
+        </w:rPr>
+        <w:t>El CronJob de drift existe y está programado: `kubectl get cronjob drift-monitor`. Ver Sección 29 para ejecutarlo a mano y leer su veredicto.</w:t>
+      </w:r>
+    </w:p>
+    <w:p>
+      <w:pPr>
         <w:pStyle w:val="Heading1"/>
         <w:spacing w:before="440" w:after="200"/>
       </w:pPr>
@@ -5698,7 +6020,7 @@
           <w:color w:val="555555"/>
           <w:sz w:val="19"/>
         </w:rPr>
-        <w:t>El pod de la API carga el modelo aliasado a `staging` solo al arrancar (evento `model_load_attempt` en los logs) — para que sirva una versión recién promovida hace falta un reinicio del pod (`kubectl rollout restart deployment/api`) o esperar al siguiente despliegue.</w:t>
+        <w:t>La API relee el alias `staging` cada `MODEL_REFRESH_SECONDS` (300 s, fijado en kubernetes/base/mlops-config.env), así que una versión recién promovida entra en servicio sola en menos de cinco minutos — ya NO hace falta `kubectl rollout restart deployment/api`. Ese ajuste antes estaba en 0 y era una simple optimización; con el monitoreo de drift pasó a ser indispensable, porque el monitor evalúa la versión a la que apunta el alias y filtra el log de predicciones por ella: una API sirviendo la versión anterior produciría una ventana con cero filas y un veredicto SKIPPED permanente. En los logs el evento es `model_refreshed`.</w:t>
       </w:r>
     </w:p>
     <w:p>
@@ -6025,7 +6347,7 @@
           <w:color w:val="555555"/>
           <w:sz w:val="19"/>
         </w:rPr>
-        <w:t>aws ecr batch-delete-image --repository-name hotel-mlops-api --image-ids imageTag=latest (repetir por repositorio/tag si hace falta).</w:t>
+        <w:t>aws ecr batch-delete-image --repository-name hotel-mlops-api --image-ids imageTag=latest   # repetir para hotel-mlops-dashboard, hotel-mlops-mlflow y hotel-mlops-jobs</w:t>
       </w:r>
     </w:p>
     <w:p>
@@ -6452,12 +6774,12 @@
         <w:pStyle w:val="ListBullet"/>
       </w:pPr>
       <w:r>
-        <w:t>terraform/bootstrap-iam-user.tf (nuevo)</w:t>
-      </w:r>
-    </w:p>
-    <w:p>
-      <w:r>
-        <w:t>Usuario IAM de automatizacion declarado como codigo, para dejar de usar la access key de root en cualquier operacion posterior al bootstrap. Ver Seccion 24.</w:t>
+        <w:t>terraform/bootstrap/main.tf (nuevo)</w:t>
+      </w:r>
+    </w:p>
+    <w:p>
+      <w:r>
+        <w:t>Usuario IAM de automatizacion declarado como codigo, para dejar de usar la access key de root en cualquier operacion posterior al bootstrap. Nacio como terraform/bootstrap-iam-user.tf dentro de la configuracion principal y se movio a su propia configuracion con estado local por el fallo de teardown descrito en la Seccion 27. Ver Seccion 24.</w:t>
       </w:r>
     </w:p>
     <w:p>
@@ -7210,6 +7532,1626 @@
       <w:pPr/>
       <w:r>
         <w:t>kubectl get applications -n argocd: Synced / Healthy. curl al ELB de api-service: /health responde model_loaded=true y /predict devuelve una prediccion real (predicted_market_segment=Direct) usando el payload de ejemplo del README. Dashboard de Streamlit responde 200 a traves de su propio ELB. El pipeline completo de GitLab CI (quality-gate, trivy-scan, train-smoke, integration-tests, build-push-ecr, gitops-release) corrio de punta a punta en el runner local dedicado y quedo en verde. Cuenta de AWS compartida con otros dos proyectos en paralelo (predictive-maintenance-mlops y dlinear-forecast) durante toda esta ejecucion, sin tocar ninguno de sus recursos.</w:t>
+      </w:r>
+    </w:p>
+    <w:p>
+      <w:pPr>
+        <w:pStyle w:val="Heading1"/>
+        <w:spacing w:before="440" w:after="200"/>
+      </w:pPr>
+      <w:r>
+        <w:rPr>
+          <w:b/>
+          <w:color w:val="0B5CAD"/>
+          <w:sz w:val="32"/>
+        </w:rPr>
+        <w:t>29. El bucle de monitoreo de drift (local y en producción)</w:t>
+      </w:r>
+    </w:p>
+    <w:p>
+      <w:pPr>
+        <w:spacing w:after="120"/>
+      </w:pPr>
+      <w:r>
+        <w:rPr>
+          <w:b w:val="0"/>
+          <w:i w:val="0"/>
+          <w:sz w:val="21"/>
+        </w:rPr>
+        <w:t>Entrenar y servir son dos tercios del ciclo de vida de un modelo. El tercio restante es averiguar si el modelo SIGUE estando en lo cierto meses después de haberse promovido. Esta sección cubre esa parte: qué se registra en producción, cómo se ejercita el bucle completo en una laptop, y cómo se lee el veredicto.</w:t>
+      </w:r>
+    </w:p>
+    <w:p>
+      <w:pPr>
+        <w:spacing w:after="120"/>
+      </w:pPr>
+      <w:r>
+        <w:rPr>
+          <w:b w:val="0"/>
+          <w:i w:val="0"/>
+          <w:sz w:val="21"/>
+        </w:rPr>
+        <w:t>El bucle tiene dos mitades que viven en proyectos distintos. La de escritura (api/monitoring.py) persiste cada predicción servida y, más tarde, la verdad que llega para ella. La de lectura (core_ml/src/monitoring/) corre una vez al día como CronJob, compara esa ventana contra la línea base registrada con la versión del modelo que se está sirviendo, y deja el veredicto como un run de MLflow.</w:t>
+      </w:r>
+    </w:p>
+    <w:p>
+      <w:pPr>
+        <w:shd w:val="clear" w:color="auto" w:fill="FFF4E5"/>
+        <w:pBdr>
+          <w:top w:val="single" w:sz="6" w:space="4" w:color="B46A00"/>
+          <w:bottom w:val="single" w:sz="6" w:space="4" w:color="B46A00"/>
+          <w:left w:val="single" w:sz="6" w:space="4" w:color="B46A00"/>
+          <w:right w:val="single" w:sz="6" w:space="4" w:color="B46A00"/>
+        </w:pBdr>
+        <w:spacing w:before="120" w:after="40"/>
+        <w:ind w:left="113"/>
+      </w:pPr>
+      <w:r>
+        <w:rPr>
+          <w:b/>
+          <w:color w:val="B46A00"/>
+          <w:sz w:val="20"/>
+        </w:rPr>
+        <w:t>⚠ Un modelo sin línea base no es monitoreable</w:t>
+      </w:r>
+    </w:p>
+    <w:p>
+      <w:pPr>
+        <w:shd w:val="clear" w:color="auto" w:fill="FFF4E5"/>
+        <w:pBdr>
+          <w:top w:val="single" w:sz="6" w:space="4" w:color="B46A00"/>
+          <w:bottom w:val="single" w:sz="6" w:space="4" w:color="B46A00"/>
+          <w:left w:val="single" w:sz="6" w:space="4" w:color="B46A00"/>
+          <w:right w:val="single" w:sz="6" w:space="4" w:color="B46A00"/>
+        </w:pBdr>
+        <w:spacing w:before="0" w:after="200"/>
+        <w:ind w:left="113"/>
+      </w:pPr>
+      <w:r>
+        <w:rPr>
+          <w:color w:val="5A3D00"/>
+          <w:sz w:val="19"/>
+        </w:rPr>
+        <w:t>El drift es una COMPARACIÓN, así que el monitor necesita una referencia inmutable. El entrenamiento la registra como artefacto monitoring/reference_profile.json del propio run (evento `reference_profile_logged`). Un modelo entrenado antes de que esto existiera no la tiene: el monitor lo reporta como SKIPPED con "retrain to publish a monitoring baseline" en vez de reventar. La solución es reentrenar, no tocar el monitor.</w:t>
+      </w:r>
+    </w:p>
+    <w:p>
+      <w:pPr>
+        <w:pStyle w:val="Heading2"/>
+        <w:spacing w:before="240" w:after="80"/>
+      </w:pPr>
+      <w:r>
+        <w:rPr>
+          <w:b/>
+          <w:color w:val="1F2937"/>
+          <w:sz w:val="25"/>
+        </w:rPr>
+        <w:t>Qué mide: cuatro preguntas, y solo una es concept drift</w:t>
+      </w:r>
+    </w:p>
+    <w:p>
+      <w:pPr>
+        <w:pStyle w:val="ListBullet"/>
+        <w:spacing w:after="80"/>
+      </w:pPr>
+      <w:r>
+        <w:rPr>
+          <w:sz w:val="21"/>
+        </w:rPr>
+        <w:t>Data drift — ¿se movió P(X)? PSI por característica contra la línea base, más el cambio en la tasa de nulos. No necesita etiquetas.</w:t>
+      </w:r>
+    </w:p>
+    <w:p>
+      <w:pPr>
+        <w:pStyle w:val="ListBullet"/>
+        <w:spacing w:after="80"/>
+      </w:pPr>
+      <w:r>
+        <w:rPr>
+          <w:sz w:val="21"/>
+        </w:rPr>
+        <w:t>Prediction drift — ¿se movió P(ŷ)? La mezcla de segmentos predichos. No necesita etiquetas.</w:t>
+      </w:r>
+    </w:p>
+    <w:p>
+      <w:pPr>
+        <w:pStyle w:val="ListBullet"/>
+        <w:spacing w:after="80"/>
+      </w:pPr>
+      <w:r>
+        <w:rPr>
+          <w:sz w:val="21"/>
+        </w:rPr>
+        <w:t>Confidence drift — ¿el modelo está menos seguro? Probabilidad media de la clase ganadora y margen sobre la segunda. No necesita etiquetas.</w:t>
+      </w:r>
+    </w:p>
+    <w:p>
+      <w:pPr>
+        <w:pStyle w:val="ListBullet"/>
+        <w:spacing w:after="80"/>
+      </w:pPr>
+      <w:r>
+        <w:rPr>
+          <w:sz w:val="21"/>
+        </w:rPr>
+        <w:t>CONCEPT drift — ¿se movió P(y|X), es decir, el modelo sigue estando EN LO CIERTO? F1 ponderado sobre la ventana etiquetada contra el F1 de la línea base. SÍ necesita etiquetas, y es la única de las cuatro que puede levantar ALERT por sí sola.</w:t>
+      </w:r>
+    </w:p>
+    <w:p>
+      <w:pPr>
+        <w:spacing w:after="120"/>
+        <w:ind w:left="624"/>
+      </w:pPr>
+      <w:r>
+        <w:rPr>
+          <w:i/>
+          <w:color w:val="555555"/>
+          <w:sz w:val="19"/>
+        </w:rPr>
+        <w:t>Las otras tres son aviso temprano mientras las etiquetas todavía no llegan. Tratarlas como alertas es exactamente cómo un monitor acaba despertando a alguien por un cambio estacional en la mezcla de reservas, y cómo se acaba silenciando.</w:t>
+      </w:r>
+    </w:p>
+    <w:p>
+      <w:pPr>
+        <w:pStyle w:val="Heading2"/>
+        <w:spacing w:before="240" w:after="80"/>
+      </w:pPr>
+      <w:r>
+        <w:rPr>
+          <w:b/>
+          <w:color w:val="1F2937"/>
+          <w:sz w:val="25"/>
+        </w:rPr>
+        <w:t>Ejecutarlo en local, de extremo a extremo</w:t>
+      </w:r>
+    </w:p>
+    <w:p>
+      <w:pPr>
+        <w:spacing w:after="120"/>
+      </w:pPr>
+      <w:r>
+        <w:rPr>
+          <w:b w:val="0"/>
+          <w:i w:val="0"/>
+          <w:sz w:val="21"/>
+        </w:rPr>
+        <w:t>Todo esto corre en una laptop, y el job de drift usa la MISMA imagen y el MISMO entrypoint que el CronJob de producción (Dockerfile.jobs), así que lo que se valida aquí es literalmente lo que se va a programar en EKS.</w:t>
+      </w:r>
+    </w:p>
+    <w:p>
+      <w:pPr>
+        <w:pStyle w:val="ListNumber"/>
+        <w:spacing w:after="80"/>
+      </w:pPr>
+      <w:r>
+        <w:rPr>
+          <w:sz w:val="21"/>
+        </w:rPr>
+        <w:t>Levantar el stack (Sección 4) y tener un modelo entrenado y aliasado a `staging` (Sección 3).</w:t>
+      </w:r>
+    </w:p>
+    <w:p>
+      <w:pPr>
+        <w:spacing w:after="0" w:before="0"/>
+        <w:ind w:left="170"/>
+        <w:shd w:val="clear" w:color="auto" w:fill="EDEFF2"/>
+      </w:pPr>
+      <w:r>
+        <w:rPr>
+          <w:rFonts w:ascii="Consolas" w:hAnsi="Consolas"/>
+          <w:color w:val="1A1A1A"/>
+          <w:sz w:val="19"/>
+        </w:rPr>
+        <w:t>make up</w:t>
+      </w:r>
+    </w:p>
+    <w:p>
+      <w:pPr>
+        <w:spacing w:after="160"/>
+      </w:pPr>
+    </w:p>
+    <w:p>
+      <w:pPr>
+        <w:pStyle w:val="ListNumber"/>
+        <w:spacing w:after="80"/>
+      </w:pPr>
+      <w:r>
+        <w:rPr>
+          <w:sz w:val="21"/>
+        </w:rPr>
+        <w:t>(Opcional pero recomendado) Fijar un periodo de entrenamiento, para que el backtest sea honesto. En core_ml/config/config.yaml, bloque `data`:</w:t>
+      </w:r>
+    </w:p>
+    <w:p>
+      <w:pPr>
+        <w:spacing w:after="0" w:before="0"/>
+        <w:ind w:left="170"/>
+        <w:shd w:val="clear" w:color="auto" w:fill="EDEFF2"/>
+      </w:pPr>
+      <w:r>
+        <w:rPr>
+          <w:rFonts w:ascii="Consolas" w:hAnsi="Consolas"/>
+          <w:color w:val="1A1A1A"/>
+          <w:sz w:val="19"/>
+        </w:rPr>
+        <w:t>train_max_year: 2016</w:t>
+      </w:r>
+    </w:p>
+    <w:p>
+      <w:pPr>
+        <w:spacing w:after="160"/>
+      </w:pPr>
+    </w:p>
+    <w:p>
+      <w:pPr>
+        <w:spacing w:after="120"/>
+        <w:ind w:left="624"/>
+      </w:pPr>
+      <w:r>
+        <w:rPr>
+          <w:i/>
+          <w:color w:val="555555"/>
+          <w:sz w:val="19"/>
+        </w:rPr>
+        <w:t>El dataset abarca de 2015-07 a 2017-08 y su mezcla de canales se desplaza de verdad hacia las agencias online en ese periodo. Entrenando solo hasta 2016 y reproduciendo 2017 se mide el monitor contra un desplazamiento REAL, no contra ruido inyectado. Dejado en `null` (el valor por defecto) el entrenamiento usa el dataset completo y el tráfico de 2017 queda dentro de la distribución por construcción.</w:t>
+      </w:r>
+    </w:p>
+    <w:p>
+      <w:pPr>
+        <w:pStyle w:val="ListNumber"/>
+        <w:spacing w:after="80"/>
+      </w:pPr>
+      <w:r>
+        <w:rPr>
+          <w:sz w:val="21"/>
+        </w:rPr>
+        <w:t>Reentrenar con ese periodo, para que la línea base preceda a los datos que se van a reproducir:</w:t>
+      </w:r>
+    </w:p>
+    <w:p>
+      <w:pPr>
+        <w:spacing w:after="0" w:before="0"/>
+        <w:ind w:left="170"/>
+        <w:shd w:val="clear" w:color="auto" w:fill="EDEFF2"/>
+      </w:pPr>
+      <w:r>
+        <w:rPr>
+          <w:rFonts w:ascii="Consolas" w:hAnsi="Consolas"/>
+          <w:color w:val="1A1A1A"/>
+          <w:sz w:val="19"/>
+        </w:rPr>
+        <w:t>make train</w:t>
+      </w:r>
+    </w:p>
+    <w:p>
+      <w:pPr>
+        <w:spacing w:after="160"/>
+      </w:pPr>
+    </w:p>
+    <w:p>
+      <w:pPr>
+        <w:pStyle w:val="ListNumber"/>
+        <w:spacing w:after="80"/>
+      </w:pPr>
+      <w:r>
+        <w:rPr>
+          <w:sz w:val="21"/>
+        </w:rPr>
+        <w:t>Generar tráfico real contra la API: reproduce reservas del periodo base y concilia su verdad.</w:t>
+      </w:r>
+    </w:p>
+    <w:p>
+      <w:pPr>
+        <w:spacing w:after="0" w:before="0"/>
+        <w:ind w:left="170"/>
+        <w:shd w:val="clear" w:color="auto" w:fill="EDEFF2"/>
+      </w:pPr>
+      <w:r>
+        <w:rPr>
+          <w:rFonts w:ascii="Consolas" w:hAnsi="Consolas"/>
+          <w:color w:val="1A1A1A"/>
+          <w:sz w:val="19"/>
+        </w:rPr>
+        <w:t>make replay</w:t>
+      </w:r>
+    </w:p>
+    <w:p>
+      <w:pPr>
+        <w:spacing w:after="160"/>
+      </w:pPr>
+    </w:p>
+    <w:p>
+      <w:pPr>
+        <w:spacing w:after="120"/>
+        <w:ind w:left="624"/>
+      </w:pPr>
+      <w:r>
+        <w:rPr>
+          <w:i/>
+          <w:color w:val="555555"/>
+          <w:sz w:val="19"/>
+        </w:rPr>
+        <w:t>Equivale a `python scripts/replay_bookings.py --year 2016 --limit 3000`. Envía cada reserva a POST /predict y después publica el `market_segment` REAL de esa reserva en POST /feedback (el 80% por defecto, `--label-fraction`, para simular que la conciliación va por detrás). No inventa datos: reproduce el dataset.</w:t>
+      </w:r>
+    </w:p>
+    <w:p>
+      <w:pPr>
+        <w:pStyle w:val="ListNumber"/>
+        <w:spacing w:after="80"/>
+      </w:pPr>
+      <w:r>
+        <w:rPr>
+          <w:sz w:val="21"/>
+        </w:rPr>
+        <w:t>Generar la ventana del periodo donde la mezcla se movió:</w:t>
+      </w:r>
+    </w:p>
+    <w:p>
+      <w:pPr>
+        <w:spacing w:after="0" w:before="0"/>
+        <w:ind w:left="170"/>
+        <w:shd w:val="clear" w:color="auto" w:fill="EDEFF2"/>
+      </w:pPr>
+      <w:r>
+        <w:rPr>
+          <w:rFonts w:ascii="Consolas" w:hAnsi="Consolas"/>
+          <w:color w:val="1A1A1A"/>
+          <w:sz w:val="19"/>
+        </w:rPr>
+        <w:t>make replay-drift</w:t>
+      </w:r>
+    </w:p>
+    <w:p>
+      <w:pPr>
+        <w:spacing w:after="160"/>
+      </w:pPr>
+    </w:p>
+    <w:p>
+      <w:pPr>
+        <w:spacing w:after="120"/>
+        <w:ind w:left="624"/>
+      </w:pPr>
+      <w:r>
+        <w:rPr>
+          <w:i/>
+          <w:color w:val="555555"/>
+          <w:sz w:val="19"/>
+        </w:rPr>
+        <w:t>Equivale a `--year 2017 --months 5 6 7 --limit 3000`.</w:t>
+      </w:r>
+    </w:p>
+    <w:p>
+      <w:pPr>
+        <w:pStyle w:val="ListNumber"/>
+        <w:spacing w:after="80"/>
+      </w:pPr>
+      <w:r>
+        <w:rPr>
+          <w:sz w:val="21"/>
+        </w:rPr>
+        <w:t>Ejecutar el monitor, desde la imagen real de jobs:</w:t>
+      </w:r>
+    </w:p>
+    <w:p>
+      <w:pPr>
+        <w:spacing w:after="0" w:before="0"/>
+        <w:ind w:left="170"/>
+        <w:shd w:val="clear" w:color="auto" w:fill="EDEFF2"/>
+      </w:pPr>
+      <w:r>
+        <w:rPr>
+          <w:rFonts w:ascii="Consolas" w:hAnsi="Consolas"/>
+          <w:color w:val="1A1A1A"/>
+          <w:sz w:val="19"/>
+        </w:rPr>
+        <w:t>make drift-report</w:t>
+      </w:r>
+    </w:p>
+    <w:p>
+      <w:pPr>
+        <w:spacing w:after="160"/>
+      </w:pPr>
+    </w:p>
+    <w:p>
+      <w:pPr>
+        <w:spacing w:after="120"/>
+        <w:ind w:left="624"/>
+      </w:pPr>
+      <w:r>
+        <w:rPr>
+          <w:i/>
+          <w:color w:val="555555"/>
+          <w:sz w:val="19"/>
+        </w:rPr>
+        <w:t>Equivale a `docker compose --profile jobs run --rm --build drift-monitor`. Está detrás de un perfil porque es un job, no un servicio: `make up` no debe arrancarlo.</w:t>
+      </w:r>
+    </w:p>
+    <w:p>
+      <w:pPr>
+        <w:pStyle w:val="ListBullet"/>
+        <w:spacing w:after="80"/>
+        <w:ind w:left="340"/>
+      </w:pPr>
+      <w:r>
+        <w:rPr>
+          <w:sz w:val="22"/>
+        </w:rPr>
+        <w:t xml:space="preserve">☐  </w:t>
+      </w:r>
+      <w:r>
+        <w:rPr>
+          <w:sz w:val="21"/>
+        </w:rPr>
+        <w:t>En la UI de MLflow (http://localhost:5050) aparece el experimento `hotel_market_segmentation_monitoring` con un run nuevo llamado `drift-&lt;timestamp&gt;`.</w:t>
+      </w:r>
+    </w:p>
+    <w:p>
+      <w:pPr>
+        <w:pStyle w:val="ListBullet"/>
+        <w:spacing w:after="80"/>
+        <w:ind w:left="340"/>
+      </w:pPr>
+      <w:r>
+        <w:rPr>
+          <w:sz w:val="22"/>
+        </w:rPr>
+        <w:t xml:space="preserve">☐  </w:t>
+      </w:r>
+      <w:r>
+        <w:rPr>
+          <w:sz w:val="21"/>
+        </w:rPr>
+        <w:t>Ese run trae los artefactos `drift/drift_report.html` (el informe legible, que se abre en el visor de MLflow) y `drift/drift_report.json` (el mismo veredicto, para máquinas).</w:t>
+      </w:r>
+    </w:p>
+    <w:p>
+      <w:pPr>
+        <w:pStyle w:val="ListBullet"/>
+        <w:spacing w:after="80"/>
+        <w:ind w:left="340"/>
+      </w:pPr>
+      <w:r>
+        <w:rPr>
+          <w:sz w:val="22"/>
+        </w:rPr>
+        <w:t xml:space="preserve">☐  </w:t>
+      </w:r>
+      <w:r>
+        <w:rPr>
+          <w:sz w:val="21"/>
+        </w:rPr>
+        <w:t>Y las métricas `concept_baseline_f1`, `concept_live_f1`, `concept_live_f1_lower` / `_upper`, `drift_share`, `label_coverage` y un `psi_&lt;feature&gt;` por característica — esto último es lo que permite graficar el PSI de una feature a lo largo de todas las ventanas y ver que lleva una semana subiendo.</w:t>
+      </w:r>
+    </w:p>
+    <w:p>
+      <w:pPr>
+        <w:pStyle w:val="ListBullet"/>
+        <w:spacing w:after="80"/>
+        <w:ind w:left="340"/>
+      </w:pPr>
+      <w:r>
+        <w:rPr>
+          <w:sz w:val="22"/>
+        </w:rPr>
+        <w:t xml:space="preserve">☐  </w:t>
+      </w:r>
+      <w:r>
+        <w:rPr>
+          <w:sz w:val="21"/>
+        </w:rPr>
+        <w:t>Con poco tráfico el veredicto es `SKIPPED` y dice por qué. Es correcto: por debajo de `min_predictions` (500) o `min_labelled` (300) el monitor NO dice "sin drift", dice "no pude determinarlo". Son cosas distintas y piden respuestas opuestas.</w:t>
+      </w:r>
+    </w:p>
+    <w:p>
+      <w:pPr>
+        <w:pStyle w:val="Heading2"/>
+        <w:spacing w:before="240" w:after="80"/>
+      </w:pPr>
+      <w:r>
+        <w:rPr>
+          <w:b/>
+          <w:color w:val="1F2937"/>
+          <w:sz w:val="25"/>
+        </w:rPr>
+        <w:t>Los dos endpoints que hacen posible el bucle</w:t>
+      </w:r>
+    </w:p>
+    <w:p>
+      <w:pPr>
+        <w:spacing w:after="120"/>
+      </w:pPr>
+      <w:r>
+        <w:rPr>
+          <w:b w:val="0"/>
+          <w:i w:val="0"/>
+          <w:sz w:val="21"/>
+        </w:rPr>
+        <w:t>POST /predict devuelve ahora, además del segmento, la clave de correlación y dos señales de incertidumbre:</w:t>
+      </w:r>
+    </w:p>
+    <w:p>
+      <w:pPr>
+        <w:spacing w:after="0" w:before="0"/>
+        <w:ind w:left="170"/>
+        <w:shd w:val="clear" w:color="auto" w:fill="EDEFF2"/>
+      </w:pPr>
+      <w:r>
+        <w:rPr>
+          <w:rFonts w:ascii="Consolas" w:hAnsi="Consolas"/>
+          <w:color w:val="1A1A1A"/>
+          <w:sz w:val="19"/>
+        </w:rPr>
+        <w:t>{</w:t>
+      </w:r>
+    </w:p>
+    <w:p>
+      <w:pPr>
+        <w:spacing w:after="0" w:before="0"/>
+        <w:ind w:left="170"/>
+        <w:shd w:val="clear" w:color="auto" w:fill="EDEFF2"/>
+      </w:pPr>
+      <w:r>
+        <w:rPr>
+          <w:rFonts w:ascii="Consolas" w:hAnsi="Consolas"/>
+          <w:color w:val="1A1A1A"/>
+          <w:sz w:val="19"/>
+        </w:rPr>
+        <w:t xml:space="preserve">  "predicted_market_segment": "Direct",</w:t>
+      </w:r>
+    </w:p>
+    <w:p>
+      <w:pPr>
+        <w:spacing w:after="0" w:before="0"/>
+        <w:ind w:left="170"/>
+        <w:shd w:val="clear" w:color="auto" w:fill="EDEFF2"/>
+      </w:pPr>
+      <w:r>
+        <w:rPr>
+          <w:rFonts w:ascii="Consolas" w:hAnsi="Consolas"/>
+          <w:color w:val="1A1A1A"/>
+          <w:sz w:val="19"/>
+        </w:rPr>
+        <w:t xml:space="preserve">  "prediction_id": "6f1c3f2a-6b1e-4a9e-9a8d-1f0f0f4a2b77",</w:t>
+      </w:r>
+    </w:p>
+    <w:p>
+      <w:pPr>
+        <w:spacing w:after="0" w:before="0"/>
+        <w:ind w:left="170"/>
+        <w:shd w:val="clear" w:color="auto" w:fill="EDEFF2"/>
+      </w:pPr>
+      <w:r>
+        <w:rPr>
+          <w:rFonts w:ascii="Consolas" w:hAnsi="Consolas"/>
+          <w:color w:val="1A1A1A"/>
+          <w:sz w:val="19"/>
+        </w:rPr>
+        <w:t xml:space="preserve">  "model_version": "7",</w:t>
+      </w:r>
+    </w:p>
+    <w:p>
+      <w:pPr>
+        <w:spacing w:after="0" w:before="0"/>
+        <w:ind w:left="170"/>
+        <w:shd w:val="clear" w:color="auto" w:fill="EDEFF2"/>
+      </w:pPr>
+      <w:r>
+        <w:rPr>
+          <w:rFonts w:ascii="Consolas" w:hAnsi="Consolas"/>
+          <w:color w:val="1A1A1A"/>
+          <w:sz w:val="19"/>
+        </w:rPr>
+        <w:t xml:space="preserve">  "confidence": 0.92,</w:t>
+      </w:r>
+    </w:p>
+    <w:p>
+      <w:pPr>
+        <w:spacing w:after="0" w:before="0"/>
+        <w:ind w:left="170"/>
+        <w:shd w:val="clear" w:color="auto" w:fill="EDEFF2"/>
+      </w:pPr>
+      <w:r>
+        <w:rPr>
+          <w:rFonts w:ascii="Consolas" w:hAnsi="Consolas"/>
+          <w:color w:val="1A1A1A"/>
+          <w:sz w:val="19"/>
+        </w:rPr>
+        <w:t xml:space="preserve">  "margin": 0.84</w:t>
+      </w:r>
+    </w:p>
+    <w:p>
+      <w:pPr>
+        <w:spacing w:after="0" w:before="0"/>
+        <w:ind w:left="170"/>
+        <w:shd w:val="clear" w:color="auto" w:fill="EDEFF2"/>
+      </w:pPr>
+      <w:r>
+        <w:rPr>
+          <w:rFonts w:ascii="Consolas" w:hAnsi="Consolas"/>
+          <w:color w:val="1A1A1A"/>
+          <w:sz w:val="19"/>
+        </w:rPr>
+        <w:t>}</w:t>
+      </w:r>
+    </w:p>
+    <w:p>
+      <w:pPr>
+        <w:spacing w:after="160"/>
+      </w:pPr>
+    </w:p>
+    <w:p>
+      <w:pPr>
+        <w:spacing w:after="120"/>
+        <w:ind w:left="624"/>
+      </w:pPr>
+      <w:r>
+        <w:rPr>
+          <w:i/>
+          <w:color w:val="555555"/>
+          <w:sz w:val="19"/>
+        </w:rPr>
+        <w:t>`confidence` es la probabilidad de la clase ganadora; `margin` es su distancia a la segunda. Un modelo puede seguir muy confiado mientras alterna entre dos clases que ya no sabe separar, y solo el margen lo muestra.</w:t>
+      </w:r>
+    </w:p>
+    <w:p>
+      <w:pPr>
+        <w:spacing w:after="120"/>
+      </w:pPr>
+      <w:r>
+        <w:rPr>
+          <w:b w:val="0"/>
+          <w:i w:val="0"/>
+          <w:sz w:val="21"/>
+        </w:rPr>
+        <w:t>POST /feedback recibe la verdad, en lotes, cuando la reserva se concilia contra su canal de registro:</w:t>
+      </w:r>
+    </w:p>
+    <w:p>
+      <w:pPr>
+        <w:spacing w:after="0" w:before="0"/>
+        <w:ind w:left="170"/>
+        <w:shd w:val="clear" w:color="auto" w:fill="EDEFF2"/>
+      </w:pPr>
+      <w:r>
+        <w:rPr>
+          <w:rFonts w:ascii="Consolas" w:hAnsi="Consolas"/>
+          <w:color w:val="1A1A1A"/>
+          <w:sz w:val="19"/>
+        </w:rPr>
+        <w:t>curl -X POST http://localhost:8000/feedback \</w:t>
+      </w:r>
+    </w:p>
+    <w:p>
+      <w:pPr>
+        <w:spacing w:after="0" w:before="0"/>
+        <w:ind w:left="170"/>
+        <w:shd w:val="clear" w:color="auto" w:fill="EDEFF2"/>
+      </w:pPr>
+      <w:r>
+        <w:rPr>
+          <w:rFonts w:ascii="Consolas" w:hAnsi="Consolas"/>
+          <w:color w:val="1A1A1A"/>
+          <w:sz w:val="19"/>
+        </w:rPr>
+        <w:t xml:space="preserve">  -H 'Content-Type: application/json' \</w:t>
+      </w:r>
+    </w:p>
+    <w:p>
+      <w:pPr>
+        <w:spacing w:after="0" w:before="0"/>
+        <w:ind w:left="170"/>
+        <w:shd w:val="clear" w:color="auto" w:fill="EDEFF2"/>
+      </w:pPr>
+      <w:r>
+        <w:rPr>
+          <w:rFonts w:ascii="Consolas" w:hAnsi="Consolas"/>
+          <w:color w:val="1A1A1A"/>
+          <w:sz w:val="19"/>
+        </w:rPr>
+        <w:t xml:space="preserve">  -d '[{</w:t>
+      </w:r>
+    </w:p>
+    <w:p>
+      <w:pPr>
+        <w:spacing w:after="0" w:before="0"/>
+        <w:ind w:left="170"/>
+        <w:shd w:val="clear" w:color="auto" w:fill="EDEFF2"/>
+      </w:pPr>
+      <w:r>
+        <w:rPr>
+          <w:rFonts w:ascii="Consolas" w:hAnsi="Consolas"/>
+          <w:color w:val="1A1A1A"/>
+          <w:sz w:val="19"/>
+        </w:rPr>
+        <w:t xml:space="preserve">    "prediction_id": "6f1c3f2a-6b1e-4a9e-9a8d-1f0f0f4a2b77",</w:t>
+      </w:r>
+    </w:p>
+    <w:p>
+      <w:pPr>
+        <w:spacing w:after="0" w:before="0"/>
+        <w:ind w:left="170"/>
+        <w:shd w:val="clear" w:color="auto" w:fill="EDEFF2"/>
+      </w:pPr>
+      <w:r>
+        <w:rPr>
+          <w:rFonts w:ascii="Consolas" w:hAnsi="Consolas"/>
+          <w:color w:val="1A1A1A"/>
+          <w:sz w:val="19"/>
+        </w:rPr>
+        <w:t xml:space="preserve">    "actual_market_segment": "Online TA",</w:t>
+      </w:r>
+    </w:p>
+    <w:p>
+      <w:pPr>
+        <w:spacing w:after="0" w:before="0"/>
+        <w:ind w:left="170"/>
+        <w:shd w:val="clear" w:color="auto" w:fill="EDEFF2"/>
+      </w:pPr>
+      <w:r>
+        <w:rPr>
+          <w:rFonts w:ascii="Consolas" w:hAnsi="Consolas"/>
+          <w:color w:val="1A1A1A"/>
+          <w:sz w:val="19"/>
+        </w:rPr>
+        <w:t xml:space="preserve">    "label_source": "reconciliation"</w:t>
+      </w:r>
+    </w:p>
+    <w:p>
+      <w:pPr>
+        <w:spacing w:after="0" w:before="0"/>
+        <w:ind w:left="170"/>
+        <w:shd w:val="clear" w:color="auto" w:fill="EDEFF2"/>
+      </w:pPr>
+      <w:r>
+        <w:rPr>
+          <w:rFonts w:ascii="Consolas" w:hAnsi="Consolas"/>
+          <w:color w:val="1A1A1A"/>
+          <w:sz w:val="19"/>
+        </w:rPr>
+        <w:t xml:space="preserve">  }]'</w:t>
+      </w:r>
+    </w:p>
+    <w:p>
+      <w:pPr>
+        <w:spacing w:after="160"/>
+      </w:pPr>
+    </w:p>
+    <w:p>
+      <w:pPr>
+        <w:spacing w:after="0" w:before="0"/>
+        <w:ind w:left="170"/>
+        <w:shd w:val="clear" w:color="auto" w:fill="EDEFF2"/>
+      </w:pPr>
+      <w:r>
+        <w:rPr>
+          <w:rFonts w:ascii="Consolas" w:hAnsi="Consolas"/>
+          <w:color w:val="1A1A1A"/>
+          <w:sz w:val="19"/>
+        </w:rPr>
+        <w:t>{ "accepted": 1, "skipped": 0 }</w:t>
+      </w:r>
+    </w:p>
+    <w:p>
+      <w:pPr>
+        <w:spacing w:after="160"/>
+      </w:pPr>
+    </w:p>
+    <w:p>
+      <w:pPr>
+        <w:spacing w:after="120"/>
+        <w:ind w:left="624"/>
+      </w:pPr>
+      <w:r>
+        <w:rPr>
+          <w:i/>
+          <w:color w:val="555555"/>
+          <w:sz w:val="19"/>
+        </w:rPr>
+        <w:t>`skipped` NO es un error: las predicciones se persisten de forma asíncrona para que /predict siga siendo rápido, así que un llamante que concilia muy rápido puede citar un id que todavía no llegó a la tabla. Esas filas se saltan en vez de rechazarse, y el lote se vuelve a publicar — es seguro, porque la escritura es un upsert idempotente. Un `skipped` que sobrevive a los reintentos significa que esos ids nunca se sirvieron.</w:t>
+      </w:r>
+    </w:p>
+    <w:p>
+      <w:pPr>
+        <w:spacing w:after="120"/>
+      </w:pPr>
+      <w:r>
+        <w:rPr>
+          <w:b w:val="0"/>
+          <w:i w:val="0"/>
+          <w:sz w:val="21"/>
+        </w:rPr>
+        <w:t>Ambas mitades escriben en la MISMA instancia de RDS que ya usa MLflow, en el esquema `monitoring` (tablas `predictions` y `booking_labels`), con las credenciales que el pod ya tiene por `mlops-secrets`. No hace falta ningún secreto ni permiso nuevo.</w:t>
+      </w:r>
+    </w:p>
+    <w:p>
+      <w:pPr>
+        <w:pStyle w:val="Heading2"/>
+        <w:spacing w:before="240" w:after="80"/>
+      </w:pPr>
+      <w:r>
+        <w:rPr>
+          <w:b/>
+          <w:color w:val="1F2937"/>
+          <w:sz w:val="25"/>
+        </w:rPr>
+        <w:t>En producción: la cuarta imagen y el CronJob</w:t>
+      </w:r>
+    </w:p>
+    <w:p>
+      <w:pPr>
+        <w:spacing w:after="120"/>
+      </w:pPr>
+      <w:r>
+        <w:rPr>
+          <w:b w:val="0"/>
+          <w:i w:val="0"/>
+          <w:sz w:val="21"/>
+        </w:rPr>
+        <w:t>El monitor es la primera carga de trabajo del proyecto que NO es un servicio de larga duración, y por eso necesitó una cuarta imagen antes que una sola línea de estadística: las tres que existían (api, dashboard, mlflow) no contienen el código de core_ml.</w:t>
+      </w:r>
+    </w:p>
+    <w:p>
+      <w:pPr>
+        <w:pStyle w:val="ListBullet"/>
+        <w:spacing w:after="80"/>
+      </w:pPr>
+      <w:r>
+        <w:rPr>
+          <w:sz w:val="21"/>
+        </w:rPr>
+        <w:t>Dockerfile.jobs empaqueta core_ml (src/, config/, scripts/) para correr dentro del clúster. Una imagen, varios entrypoints: el CronJob de drift sobreescribe `command:` con `python -m src.monitoring.drift_monitor`; un reentrenamiento programado usaría `python -m src.train` sin construir nada nuevo.</w:t>
+      </w:r>
+    </w:p>
+    <w:p>
+      <w:pPr>
+        <w:pStyle w:val="ListBullet"/>
+        <w:spacing w:after="80"/>
+      </w:pPr>
+      <w:r>
+        <w:rPr>
+          <w:sz w:val="21"/>
+        </w:rPr>
+        <w:t>El repositorio ECR `hotel-mlops-jobs` lo crea Terraform (terraform/ecr.tf), CI lo construye y lo sube en `build-push-ecr`, y `gitops-release` escribe su tag con `kustomize edit set image` igual que los otros tres. No hay ninguna ruta especial.</w:t>
+      </w:r>
+    </w:p>
+    <w:p>
+      <w:pPr>
+        <w:pStyle w:val="ListBullet"/>
+        <w:spacing w:after="80"/>
+      </w:pPr>
+      <w:r>
+        <w:rPr>
+          <w:sz w:val="21"/>
+        </w:rPr>
+        <w:t>kubernetes/base/drift-monitor-cronjob.yaml corre a las 04:00 UTC, después de la ventana de conciliación nocturna. `concurrencyPolicy: Forbid` (dos monitores sobre ventanas solapadas escribirían veredictos contradictorios y romperían el contador de histéresis) y `backoffLimit: 0` (un fallo aquí es un ALERT real o un defecto real; reintentar esconde el segundo y duplica el primero).</w:t>
+      </w:r>
+    </w:p>
+    <w:p>
+      <w:pPr>
+        <w:pStyle w:val="ListBullet"/>
+        <w:spacing w:after="80"/>
+      </w:pPr>
+      <w:r>
+        <w:rPr>
+          <w:sz w:val="21"/>
+        </w:rPr>
+        <w:t>Corre como `jobs-sa`, con su propio rol IRSA (`jobs_iam_role_arn`, Sección 13). No reutiliza el de la API aunque hoy necesiten los mismos permisos de S3: compartirlo significaría que cada permiso que un futuro job batch necesite se concede en silencio también a la API expuesta a internet.</w:t>
+      </w:r>
+    </w:p>
+    <w:p>
+      <w:pPr>
+        <w:pStyle w:val="ListNumber"/>
+        <w:spacing w:after="80"/>
+      </w:pPr>
+      <w:r>
+        <w:rPr>
+          <w:sz w:val="21"/>
+        </w:rPr>
+        <w:t>Verificar que el CronJob existe y está programado:</w:t>
+      </w:r>
+    </w:p>
+    <w:p>
+      <w:pPr>
+        <w:spacing w:after="0" w:before="0"/>
+        <w:ind w:left="170"/>
+        <w:shd w:val="clear" w:color="auto" w:fill="EDEFF2"/>
+      </w:pPr>
+      <w:r>
+        <w:rPr>
+          <w:rFonts w:ascii="Consolas" w:hAnsi="Consolas"/>
+          <w:color w:val="1A1A1A"/>
+          <w:sz w:val="19"/>
+        </w:rPr>
+        <w:t>kubectl get cronjob drift-monitor</w:t>
+      </w:r>
+    </w:p>
+    <w:p>
+      <w:pPr>
+        <w:spacing w:after="160"/>
+      </w:pPr>
+    </w:p>
+    <w:p>
+      <w:pPr>
+        <w:pStyle w:val="ListNumber"/>
+        <w:spacing w:after="80"/>
+      </w:pPr>
+      <w:r>
+        <w:rPr>
+          <w:sz w:val="21"/>
+        </w:rPr>
+        <w:t>Forzar una ejecución a mano, sin esperar a las 04:00:</w:t>
+      </w:r>
+    </w:p>
+    <w:p>
+      <w:pPr>
+        <w:spacing w:after="0" w:before="0"/>
+        <w:ind w:left="170"/>
+        <w:shd w:val="clear" w:color="auto" w:fill="EDEFF2"/>
+      </w:pPr>
+      <w:r>
+        <w:rPr>
+          <w:rFonts w:ascii="Consolas" w:hAnsi="Consolas"/>
+          <w:color w:val="1A1A1A"/>
+          <w:sz w:val="19"/>
+        </w:rPr>
+        <w:t>kubectl create job --from=cronjob/drift-monitor drift-manual-1</w:t>
+      </w:r>
+    </w:p>
+    <w:p>
+      <w:pPr>
+        <w:spacing w:after="0" w:before="0"/>
+        <w:ind w:left="170"/>
+        <w:shd w:val="clear" w:color="auto" w:fill="EDEFF2"/>
+      </w:pPr>
+      <w:r>
+        <w:rPr>
+          <w:rFonts w:ascii="Consolas" w:hAnsi="Consolas"/>
+          <w:color w:val="1A1A1A"/>
+          <w:sz w:val="19"/>
+        </w:rPr>
+        <w:t>kubectl logs job/drift-manual-1 -f</w:t>
+      </w:r>
+    </w:p>
+    <w:p>
+      <w:pPr>
+        <w:spacing w:after="160"/>
+      </w:pPr>
+    </w:p>
+    <w:p>
+      <w:pPr>
+        <w:spacing w:after="120"/>
+        <w:ind w:left="624"/>
+      </w:pPr>
+      <w:r>
+        <w:rPr>
+          <w:i/>
+          <w:color w:val="555555"/>
+          <w:sz w:val="19"/>
+        </w:rPr>
+        <w:t>El log es una única línea estructurada `drift_report` con el veredicto completo (status, reason, model_version, n_predictions, n_labelled, concept_drift_status, drift_share). Es lo que filtra CloudWatch Logs Insights y lo primero que se ve en un `kubectl logs`.</w:t>
+      </w:r>
+    </w:p>
+    <w:p>
+      <w:pPr>
+        <w:pStyle w:val="ListBullet"/>
+        <w:spacing w:after="80"/>
+        <w:ind w:left="340"/>
+      </w:pPr>
+      <w:r>
+        <w:rPr>
+          <w:sz w:val="22"/>
+        </w:rPr>
+        <w:t xml:space="preserve">☐  </w:t>
+      </w:r>
+      <w:r>
+        <w:rPr>
+          <w:sz w:val="21"/>
+        </w:rPr>
+        <w:t>El run aparece en la UI de MLflow del clúster, bajo el mismo experimento `hotel_market_segmentation_monitoring`.</w:t>
+      </w:r>
+    </w:p>
+    <w:p>
+      <w:pPr>
+        <w:pStyle w:val="Heading2"/>
+        <w:spacing w:before="240" w:after="80"/>
+      </w:pPr>
+      <w:r>
+        <w:rPr>
+          <w:b/>
+          <w:color w:val="1F2937"/>
+          <w:sz w:val="25"/>
+        </w:rPr>
+        <w:t>Cómo leer el veredicto</w:t>
+      </w:r>
+    </w:p>
+    <w:p>
+      <w:pPr>
+        <w:pStyle w:val="ListBullet"/>
+        <w:spacing w:after="80"/>
+      </w:pPr>
+      <w:r>
+        <w:rPr>
+          <w:sz w:val="21"/>
+        </w:rPr>
+        <w:t>`OK` — no se detectó drift contra la línea base de la versión servida.</w:t>
+      </w:r>
+    </w:p>
+    <w:p>
+      <w:pPr>
+        <w:pStyle w:val="ListBullet"/>
+        <w:spacing w:after="80"/>
+      </w:pPr>
+      <w:r>
+        <w:rPr>
+          <w:sz w:val="21"/>
+        </w:rPr>
+        <w:t>`SKIPPED` — no había datos suficientes para decidir, o la versión servida no tiene línea base. NO es un visto bueno.</w:t>
+      </w:r>
+    </w:p>
+    <w:p>
+      <w:pPr>
+        <w:pStyle w:val="ListBullet"/>
+        <w:spacing w:after="80"/>
+      </w:pPr>
+      <w:r>
+        <w:rPr>
+          <w:sz w:val="21"/>
+        </w:rPr>
+        <w:t>`WARN` — algo se movió, pero no lo bastante o no de forma concluyente. Los tres drifts no supervisados (datos, predicción, confianza) topan aquí: son observaciones sobre las ENTRADAS del modelo o su seguridad, y ninguna es evidencia de que el modelo se equivoque.</w:t>
+      </w:r>
+    </w:p>
+    <w:p>
+      <w:pPr>
+        <w:pStyle w:val="ListBullet"/>
+        <w:spacing w:after="80"/>
+      </w:pPr>
+      <w:r>
+        <w:rPr>
+          <w:sz w:val="21"/>
+        </w:rPr>
+        <w:t>`ALERT` — concept drift confirmado. Exige dos cosas a la vez: que la caída de F1 sea MATERIAL (&gt;= `f1_alert_tolerance`) y CONCLUYENTE (todo el intervalo bootstrap al 95% por debajo de la línea base). Además hay histéresis: `consecutive_alerts_required` (2) ventanas consecutivas sobre la misma versión deben coincidir antes de escalar.</w:t>
+      </w:r>
+    </w:p>
+    <w:p>
+      <w:pPr>
+        <w:spacing w:after="120"/>
+      </w:pPr>
+      <w:r>
+        <w:rPr>
+          <w:b w:val="0"/>
+          <w:i w:val="0"/>
+          <w:sz w:val="21"/>
+        </w:rPr>
+        <w:t>Un ALERT confirmado hace que el proceso salga con código distinto de cero, y por tanto que el Job aparezca como Failed. Esa es la señal, deliberadamente: Kubernetes ya expone los fallos de jobs en todas partes, así que el proyecto no tiene que operar un canal de alertas propio. Se puede desactivar con `fail_on_alert: false`.</w:t>
+      </w:r>
+    </w:p>
+    <w:p>
+      <w:pPr>
+        <w:shd w:val="clear" w:color="auto" w:fill="FFF4E5"/>
+        <w:pBdr>
+          <w:top w:val="single" w:sz="6" w:space="4" w:color="B46A00"/>
+          <w:bottom w:val="single" w:sz="6" w:space="4" w:color="B46A00"/>
+          <w:left w:val="single" w:sz="6" w:space="4" w:color="B46A00"/>
+          <w:right w:val="single" w:sz="6" w:space="4" w:color="B46A00"/>
+        </w:pBdr>
+        <w:spacing w:before="120" w:after="40"/>
+        <w:ind w:left="113"/>
+      </w:pPr>
+      <w:r>
+        <w:rPr>
+          <w:b/>
+          <w:color w:val="B46A00"/>
+          <w:sz w:val="20"/>
+        </w:rPr>
+        <w:t>El monitor NUNCA reentrena ni promueve nada</w:t>
+      </w:r>
+    </w:p>
+    <w:p>
+      <w:pPr>
+        <w:shd w:val="clear" w:color="auto" w:fill="FFF4E5"/>
+        <w:pBdr>
+          <w:top w:val="single" w:sz="6" w:space="4" w:color="B46A00"/>
+          <w:bottom w:val="single" w:sz="6" w:space="4" w:color="B46A00"/>
+          <w:left w:val="single" w:sz="6" w:space="4" w:color="B46A00"/>
+          <w:right w:val="single" w:sz="6" w:space="4" w:color="B46A00"/>
+        </w:pBdr>
+        <w:spacing w:before="0" w:after="200"/>
+        <w:ind w:left="113"/>
+      </w:pPr>
+      <w:r>
+        <w:rPr>
+          <w:color w:val="5A3D00"/>
+          <w:sz w:val="19"/>
+        </w:rPr>
+        <w:t>Cerrar el bucle automáticamente — salta el drift, se reentrena, se mueve el alias — es la demo que todo el mundo quiere y el diseño que nadie debería desplegar: permite que un incidente de calidad de datos aguas arriba promueva un modelo entrenado sobre ese incidente, sin ningún humano en medio. La autoridad del job termina en registrar el hallazgo y fallar ruidosamente. Reentrenar es una decisión (Sección 21); esto es la evidencia para tomarla.</w:t>
+      </w:r>
+    </w:p>
+    <w:p>
+      <w:pPr>
+        <w:pStyle w:val="Heading2"/>
+        <w:spacing w:before="240" w:after="80"/>
+      </w:pPr>
+      <w:r>
+        <w:rPr>
+          <w:b/>
+          <w:color w:val="1F2937"/>
+          <w:sz w:val="25"/>
+        </w:rPr>
+        <w:t>Umbrales: dónde se ajustan y por qué están donde están</w:t>
+      </w:r>
+    </w:p>
+    <w:p>
+      <w:pPr>
+        <w:spacing w:after="120"/>
+      </w:pPr>
+      <w:r>
+        <w:rPr>
+          <w:b w:val="0"/>
+          <w:i w:val="0"/>
+          <w:sz w:val="21"/>
+        </w:rPr>
+        <w:t>Todo el bloque `monitoring:` de core_ml/config/config.yaml. Ninguno es un valor por defecto olvidado: un monitor que grita se silencia en quince días, y un monitor silenciado es peor que ninguno porque todavía se le cree.</w:t>
+      </w:r>
+    </w:p>
+    <w:p>
+      <w:pPr>
+        <w:pStyle w:val="ListBullet"/>
+        <w:spacing w:after="80"/>
+      </w:pPr>
+      <w:r>
+        <w:rPr>
+          <w:sz w:val="21"/>
+        </w:rPr>
+        <w:t>`window_hours: 24` — la ventana que evalúa cada ejecución.</w:t>
+      </w:r>
+    </w:p>
+    <w:p>
+      <w:pPr>
+        <w:pStyle w:val="ListBullet"/>
+        <w:spacing w:after="80"/>
+      </w:pPr>
+      <w:r>
+        <w:rPr>
+          <w:sz w:val="21"/>
+        </w:rPr>
+        <w:t>`min_predictions: 500` / `min_labelled: 300` — por debajo, SKIPPED.</w:t>
+      </w:r>
+    </w:p>
+    <w:p>
+      <w:pPr>
+        <w:pStyle w:val="ListBullet"/>
+        <w:spacing w:after="80"/>
+      </w:pPr>
+      <w:r>
+        <w:rPr>
+          <w:sz w:val="21"/>
+        </w:rPr>
+        <w:t>`drift_share_warn: 0.20` / `drift_share_alert: 0.35` — el data drift escala por la PROPORCIÓN de features que se movieron, no por una sola: una feature de treinta es estacionalidad, un tercio moviéndose junto es un cambio de pipeline o una población distinta. El PSI por feature usa las bandas estándar 0.10 / 0.25.</w:t>
+      </w:r>
+    </w:p>
+    <w:p>
+      <w:pPr>
+        <w:pStyle w:val="ListBullet"/>
+        <w:spacing w:after="80"/>
+      </w:pPr>
+      <w:r>
+        <w:rPr>
+          <w:sz w:val="21"/>
+        </w:rPr>
+        <w:t>`confidence_relative_tolerance: 0.10` — caída relativa de la confianza media. Solo puede dar WARN.</w:t>
+      </w:r>
+    </w:p>
+    <w:p>
+      <w:pPr>
+        <w:pStyle w:val="ListBullet"/>
+        <w:spacing w:after="80"/>
+      </w:pPr>
+      <w:r>
+        <w:rPr>
+          <w:sz w:val="21"/>
+        </w:rPr>
+        <w:t>`f1_warn_tolerance: 0.03` / `f1_alert_tolerance: 0.05` — la caída de F1 que importa.</w:t>
+      </w:r>
+    </w:p>
+    <w:p>
+      <w:pPr>
+        <w:pStyle w:val="ListBullet"/>
+        <w:spacing w:after="80"/>
+      </w:pPr>
+      <w:r>
+        <w:rPr>
+          <w:sz w:val="21"/>
+        </w:rPr>
+        <w:t>`bootstrap_resamples: 1000` — el intervalo que decide si la caída es concluyente.</w:t>
+      </w:r>
+    </w:p>
+    <w:p>
+      <w:pPr>
+        <w:pStyle w:val="ListBullet"/>
+        <w:spacing w:after="80"/>
+      </w:pPr>
+      <w:r>
+        <w:rPr>
+          <w:sz w:val="21"/>
+        </w:rPr>
+        <w:t>`consecutive_alerts_required: 2` — la histéresis.</w:t>
+      </w:r>
+    </w:p>
+    <w:p>
+      <w:pPr>
+        <w:pStyle w:val="ListBullet"/>
+        <w:spacing w:after="80"/>
+      </w:pPr>
+      <w:r>
+        <w:rPr>
+          <w:sz w:val="21"/>
+        </w:rPr>
+        <w:t>`max_rows: 200000` — tope duro de filas en memoria; el CronJob tiene límite de 2 GiB.</w:t>
+      </w:r>
+    </w:p>
+    <w:p>
+      <w:pPr>
+        <w:pStyle w:val="Heading2"/>
+        <w:spacing w:before="240" w:after="80"/>
+      </w:pPr>
+      <w:r>
+        <w:rPr>
+          <w:b/>
+          <w:color w:val="1F2937"/>
+          <w:sz w:val="25"/>
+        </w:rPr>
+        <w:t>Resultado del backtest real (stack local)</w:t>
+      </w:r>
+    </w:p>
+    <w:p>
+      <w:pPr>
+        <w:spacing w:after="120"/>
+      </w:pPr>
+      <w:r>
+        <w:rPr>
+          <w:b w:val="0"/>
+          <w:i w:val="0"/>
+          <w:sz w:val="21"/>
+        </w:rPr>
+        <w:t>Con `train_max_year: 2016`, entrenando y reproduciendo después las dos ventanas, el monitor produjo esto:</w:t>
+      </w:r>
+    </w:p>
+    <w:p>
+      <w:pPr>
+        <w:spacing w:after="0" w:before="0"/>
+        <w:ind w:left="170"/>
+        <w:shd w:val="clear" w:color="auto" w:fill="EDEFF2"/>
+      </w:pPr>
+      <w:r>
+        <w:rPr>
+          <w:rFonts w:ascii="Consolas" w:hAnsi="Consolas"/>
+          <w:color w:val="1A1A1A"/>
+          <w:sz w:val="19"/>
+        </w:rPr>
+        <w:t>Ventana            Preds/etiq.   F1 en vivo (IC 95%)        Base      Feat.  Concept</w:t>
+      </w:r>
+    </w:p>
+    <w:p>
+      <w:pPr>
+        <w:spacing w:after="0" w:before="0"/>
+        <w:ind w:left="170"/>
+        <w:shd w:val="clear" w:color="auto" w:fill="EDEFF2"/>
+      </w:pPr>
+      <w:r>
+        <w:rPr>
+          <w:rFonts w:ascii="Consolas" w:hAnsi="Consolas"/>
+          <w:color w:val="1A1A1A"/>
+          <w:sz w:val="19"/>
+        </w:rPr>
+        <w:t>2016 (en periodo)  1500 / 1200   0.9374 [0.9232, 0.9494]   0.9267     3%    OK</w:t>
+      </w:r>
+    </w:p>
+    <w:p>
+      <w:pPr>
+        <w:spacing w:after="0" w:before="0"/>
+        <w:ind w:left="170"/>
+        <w:shd w:val="clear" w:color="auto" w:fill="EDEFF2"/>
+      </w:pPr>
+      <w:r>
+        <w:rPr>
+          <w:rFonts w:ascii="Consolas" w:hAnsi="Consolas"/>
+          <w:color w:val="1A1A1A"/>
+          <w:sz w:val="19"/>
+        </w:rPr>
+        <w:t>2017 (fuera)       2000 / 1600   0.8982 [0.8842, 0.9121]   0.9267    13%    OK</w:t>
+      </w:r>
+    </w:p>
+    <w:p>
+      <w:pPr>
+        <w:spacing w:after="160"/>
+      </w:pPr>
+    </w:p>
+    <w:p>
+      <w:pPr>
+        <w:spacing w:after="120"/>
+      </w:pPr>
+      <w:r>
+        <w:rPr>
+          <w:b w:val="0"/>
+          <w:i w:val="0"/>
+          <w:sz w:val="21"/>
+        </w:rPr>
+        <w:t>La ventana de 2017 es la instructiva. Las entradas se movieron de forma medible (13% de las features; `adr` de una media de 99 a 120, y el mes de llegada desplazado) y el F1 cayó 0.0285 con TODO el intervalo por debajo de la línea base — o sea, la degradación es real y estadísticamente concluyente. Aun así queda por debajo de la tolerancia de 0.03, así que el monitor correctamente se niega a escalar. Data drift no es concept drift, y el sistema está construido para distinguirlos.</w:t>
+      </w:r>
+    </w:p>
+    <w:p>
+      <w:pPr>
+        <w:pStyle w:val="Heading2"/>
+        <w:spacing w:before="240" w:after="80"/>
+      </w:pPr>
+      <w:r>
+        <w:rPr>
+          <w:b/>
+          <w:color w:val="1F2937"/>
+          <w:sz w:val="25"/>
+        </w:rPr>
+        <w:t>Problemas conocidos de esta parte</w:t>
+      </w:r>
+    </w:p>
+    <w:p>
+      <w:pPr>
+        <w:pStyle w:val="ListBullet"/>
+      </w:pPr>
+      <w:r>
+        <w:t>Veredicto SKIPPED permanente pese a haber tráfico</w:t>
+      </w:r>
+    </w:p>
+    <w:p>
+      <w:r>
+        <w:t>El monitor evalúa la versión a la que apunta el alias `staging` y filtra el log de predicciones por ella. Si la API sigue sirviendo la versión anterior, la ventana sale con cero filas coincidentes. Por eso MODEL_REFRESH_SECONDS=300 está fijado en kubernetes/base/mlops-config.env: con el valor 0 antiguo la API solo recogía el alias al arrancar, y el monitor parecía sano mientras no medía nada.</w:t>
+      </w:r>
+    </w:p>
+    <w:p>
+      <w:pPr>
+        <w:pStyle w:val="ListBullet"/>
+      </w:pPr>
+      <w:r>
+        <w:t>PSI enorme e inexplicable en `company` o `agent`</w:t>
+      </w:r>
+    </w:p>
+    <w:p>
+      <w:r>
+        <w:t>No es un bug: es un train/serve skew real que este monitor sacó a la luz. Esas columnas son nulas en la mayoría de las filas de entrenamiento, pero el esquema de petición de la API las tiene con 0.0 por defecto, así que un cliente que las omite envía un valor que el modelo nunca vio. El informe lo nombra explícitamente como `missing 94% -&gt; 0% - train/serve skew` en vez de dejar un PSI de 5.6 sin explicación.</w:t>
+      </w:r>
+    </w:p>
+    <w:p>
+      <w:pPr>
+        <w:pStyle w:val="ListBullet"/>
+      </w:pPr>
+      <w:r>
+        <w:t>`/health` muestra rows_dropped creciendo</w:t>
+      </w:r>
+    </w:p>
+    <w:p>
+      <w:r>
+        <w:t>El sumidero de predicciones está degradado (base de datos caída, breaker abierto o cola llena) y se están descartando registros a propósito para no tumbar el serving. El informe de drift siguiente se calculará sobre una muestra que ya no representa el tráfico. Hay que arreglar la conectividad a RDS antes de creerse ese informe.</w:t>
+      </w:r>
+    </w:p>
+    <w:p>
+      <w:pPr>
+        <w:pStyle w:val="ListBullet"/>
+      </w:pPr>
+      <w:r>
+        <w:t>El CronJob aparece como Failed y en el log dice `drift_alert`</w:t>
+      </w:r>
+    </w:p>
+    <w:p>
+      <w:r>
+        <w:t>Es el comportamiento diseñado, no una avería: un ALERT confirmado sale con código distinto de cero para que el fallo del Job sea la alerta. Leer el `reason` del log y el artefacto drift_report.html antes de tocar nada.</w:t>
+      </w:r>
+    </w:p>
+    <w:p>
+      <w:pPr>
+        <w:pStyle w:val="Heading1"/>
+        <w:spacing w:before="440" w:after="200"/>
+      </w:pPr>
+      <w:r>
+        <w:rPr>
+          <w:b/>
+          <w:color w:val="0B5CAD"/>
+          <w:sz w:val="32"/>
+        </w:rPr>
+        <w:t>30. Tercera iteración (30/08/2026): el bucle de monitoreo, de punta a punta</w:t>
+      </w:r>
+    </w:p>
+    <w:p>
+      <w:pPr>
+        <w:spacing w:after="120"/>
+      </w:pPr>
+      <w:r>
+        <w:rPr>
+          <w:b w:val="0"/>
+          <w:i w:val="0"/>
+          <w:sz w:val="21"/>
+        </w:rPr>
+        <w:t>Qué se añadió al proyecto en esta iteración y qué cambió de lo que ya había. Mismo criterio que las Secciones 25 y 27: se listan aquí para que la guía siga siendo fiel a lo que realmente hay en el repositorio.</w:t>
+      </w:r>
+    </w:p>
+    <w:p>
+      <w:pPr>
+        <w:pStyle w:val="ListBullet"/>
+      </w:pPr>
+      <w:r>
+        <w:t>api/monitoring.py (nuevo) - el log de predicciones</w:t>
+      </w:r>
+    </w:p>
+    <w:p>
+      <w:r>
+        <w:t>Cada predicción servida se persiste en monitoring.predictions (RDS, la misma instancia de MLflow) con un prediction_id, la version del modelo y el vector de features como JSONB. La escritura NUNCA entra en la ruta de la peticion: cola en memoria acotada con put no bloqueante, volcado por lotes desde una tarea de fondo, y circuit breaker - el mismo mecanismo ya probado alrededor de Kafka. Entrega at-most-once a proposito: perder un punado de filas en un SIGTERM es aceptable para un estadistico calculado sobre miles, y comprar at-least-once habria devuelto el serving a la cadena de dependencias.</w:t>
+      </w:r>
+    </w:p>
+    <w:p>
+      <w:pPr>
+        <w:pStyle w:val="ListBullet"/>
+      </w:pPr>
+      <w:r>
+        <w:t>api/main.py + api/schemas.py - prediction_id y POST /feedback</w:t>
+      </w:r>
+    </w:p>
+    <w:p>
+      <w:r>
+        <w:t>/predict devuelve ahora prediction_id, model_version, confidence y margin. /feedback es nuevo: recibe la verdad en lotes y es la mitad que hace medible el concept drift. A diferencia de /predict su escritura es SINCRONA e idempotente - las etiquetas son de bajo volumen y no valen nada si se pierden en silencio.</w:t>
+      </w:r>
+    </w:p>
+    <w:p>
+      <w:pPr>
+        <w:pStyle w:val="ListBullet"/>
+      </w:pPr>
+      <w:r>
+        <w:t>core_ml/src/monitoring/ (nuevo) - la mitad de lectura</w:t>
+      </w:r>
+    </w:p>
+    <w:p>
+      <w:r>
+        <w:t>profile.py (la linea base inmutable), statistics.py (PSI, Jensen-Shannon, bootstrap), store.py (lecturas por ventana, con la sesion en readonly para que el monitor no pueda cambiar lo que observa), drift_monitor.py (el entrypoint del CronJob) y report.py (el HTML autocontenido). Los estadisticos estan implementados aqui, no importados de una libreria de drift: una alerta es una afirmacion operativa que tiene que ser reproducible desde una formula y un umbral bajo control de versiones, y ademas mantiene un grafo grande de dependencias fuera de `make security`.</w:t>
+      </w:r>
+    </w:p>
+    <w:p>
+      <w:pPr>
+        <w:pStyle w:val="ListBullet"/>
+      </w:pPr>
+      <w:r>
+        <w:t>core_ml/src/train.py - la linea base viaja con el modelo</w:t>
+      </w:r>
+    </w:p>
+    <w:p>
+      <w:r>
+        <w:t>El entrenamiento registra monitoring/reference_profile.json como artefacto del run: histogramas por feature, mezcla del target, y F1/exactitud/confianza/margen medidos sobre el conjunto RETENIDO (una medicion in-sample seria optimista justo en la cantidad que hace que todo trafico normal parezca concept drift). Nuevo tambien `train_max_year` en config.yaml: un periodo de entrenamiento explicito, que es lo que hace posible un backtest honesto.</w:t>
+      </w:r>
+    </w:p>
+    <w:p>
+      <w:pPr>
+        <w:pStyle w:val="ListBullet"/>
+      </w:pPr>
+      <w:r>
+        <w:t>Dockerfile.jobs (nuevo) - la cuarta imagen</w:t>
+      </w:r>
+    </w:p>
+    <w:p>
+      <w:r>
+        <w:t>Hasta ahora el repo publicaba tres imagenes y NINGUNA contenia el codigo de ML, asi que entrenar o monitorear solo se podia hacer desde una laptop contra el ELB de MLflow. Esta empaqueta core_ml para correr dentro del cluster. Una imagen, varios entrypoints. Terraform crea el repo ECR hotel-mlops-jobs y .gitlab-ci.yml la construye y la sube en build-push-ecr; gitops-release escribe su tag como el de las otras tres.</w:t>
+      </w:r>
+    </w:p>
+    <w:p>
+      <w:pPr>
+        <w:pStyle w:val="ListBullet"/>
+      </w:pPr>
+      <w:r>
+        <w:t>kubernetes/base/drift-monitor-cronjob.yaml + jobs-sa (nuevos)</w:t>
+      </w:r>
+    </w:p>
+    <w:p>
+      <w:r>
+        <w:t>CronJob diario a las 04:00 UTC con concurrencyPolicy Forbid, backoffLimit 0, limites de memoria y el mismo endurecimiento que el resto (runAsNonRoot, readOnlyRootFilesystem, capabilities drop ALL, emptyDir en /tmp y $HOME). Consume el MISMO mlops-config y mlops-secrets que la api, asi que 'donde esta el almacen de monitoreo' tiene una sola definicion y vive en Git. Un CronJob y no Airflow/Argo Workflows: un contenedor, una vez al dia, sin fan-out ni dependencias entre tareas.</w:t>
+      </w:r>
+    </w:p>
+    <w:p>
+      <w:pPr>
+        <w:pStyle w:val="ListBullet"/>
+      </w:pPr>
+      <w:r>
+        <w:t>terraform/iam.tf + terraform/ecr.tf - identidad propia para batch</w:t>
+      </w:r>
+    </w:p>
+    <w:p>
+      <w:r>
+        <w:t>jobs-sa tiene su propio rol IRSA (hotel-mlops-jobs-irsa) aunque hoy necesite exactamente los mismos permisos de S3 que api-sa. Son cargas distintas con radios de impacto y ciclos de vida distintos; compartir el rol significaria conceder en silencio a la API expuesta a internet cada permiso que un futuro job batch necesite. Hay un output nuevo, jobs_iam_role_arn, que se anota en la Seccion 13.</w:t>
+      </w:r>
+    </w:p>
+    <w:p>
+      <w:pPr>
+        <w:pStyle w:val="ListBullet"/>
+      </w:pPr>
+      <w:r>
+        <w:t>kubernetes/base/mlops-config.env - MODEL_REFRESH_SECONDS paso a ser indispensable</w:t>
+      </w:r>
+    </w:p>
+    <w:p>
+      <w:r>
+        <w:t>Estaba en 0 (la API solo leia el alias al arrancar) y era una simple optimizacion. Ahora esta en 300: el monitor filtra el log por la version a la que apunta el alias, asi que una API sirviendo la version anterior produciria una ventana vacia y un SKIPPED permanente - un monitor que se ve sano mientras no mide nada. La Seccion 21 se corrigio en consecuencia: ya no hace falta `kubectl rollout restart` tras promover un modelo.</w:t>
+      </w:r>
+    </w:p>
+    <w:p>
+      <w:pPr>
+        <w:pStyle w:val="ListBullet"/>
+      </w:pPr>
+      <w:r>
+        <w:t>integration-tests/tests/test_monitoring_schema.py (nuevo) - contrato de esquema</w:t>
+      </w:r>
+    </w:p>
+    <w:p>
+      <w:r>
+        <w:t>Las dos mitades del bucle son proyectos de Poetry separados que se publican como imagenes separadas, asi que nada en tiempo de importacion detecta el dia en que alguien renombra una columna de un lado. La consecuencia no seria un test en rojo sino un CronJob que falla a las 04:00, o peor, uno que devuelve cero filas y reporta 'sin drift' para siempre. El test extrae con `ast` las constantes SQL REALES de ambos ficheros (sin importar los modulos, para no arrastrar mlflow y pandas por leer cuatro cadenas), aplica el DDL del escritor sobre un Postgres desechable y lee con los SELECT del lector. Un renombrado falla en CI, en el commit que lo causo.</w:t>
+      </w:r>
+    </w:p>
+    <w:p>
+      <w:pPr>
+        <w:pStyle w:val="ListBullet"/>
+      </w:pPr>
+      <w:r>
+        <w:t>Makefile - los targets del bucle local</w:t>
+      </w:r>
+    </w:p>
+    <w:p>
+      <w:r>
+        <w:t>replay, replay-drift y drift-report. El ultimo corre el monitor desde la imagen real de jobs via el perfil `jobs` de docker-compose, asi que lo que se valida en local es exactamente lo que se programa en EKS. docker-compose.yml gano ademas las variables de monitoreo del servicio api y depends_on con condition: service_healthy para db y localstack.</w:t>
+      </w:r>
+    </w:p>
+    <w:p>
+      <w:pPr>
+        <w:pStyle w:val="ListBullet"/>
+      </w:pPr>
+      <w:r>
+        <w:t>Cobertura de pruebas</w:t>
+      </w:r>
+    </w:p>
+    <w:p>
+      <w:r>
+        <w:t>62 pruebas nuevas: 17 en api/tests/test_monitoring.py, 17 en core_ml/tests/test_drift_monitor.py, 12 en test_monitoring_statistics.py, 7 en test_monitoring_profile.py y 9 en el contrato de esquema. Todas entran en `make ci` / `make test-integration` sin cambios en los jobs de CI.</w:t>
+      </w:r>
+    </w:p>
+    <w:p>
+      <w:pPr>
+        <w:pStyle w:val="ListBullet"/>
+      </w:pPr>
+      <w:r>
+        <w:t>.gitignore - ficheros de plan de Terraform bajo cualquier nombre</w:t>
+      </w:r>
+    </w:p>
+    <w:p>
+      <w:r>
+        <w:t>El patron cubria `tfplan*` y `*.tfplan` pero no `tfdestroy.bin`, que un `terraform plan -destroy -out=` deja en el arbol de trabajo. Un plan de destroy contiene los mismos valores ya resueltos que uno normal - incluida la password de RDS leida de un data source - asi que se anadio `tfdestroy*`.</w:t>
+      </w:r>
+    </w:p>
+    <w:p>
+      <w:pPr>
+        <w:pStyle w:val="ListBullet"/>
+      </w:pPr>
+      <w:r>
+        <w:t>README.md / README_es.md</w:t>
+      </w:r>
+    </w:p>
+    <w:p>
+      <w:r>
+        <w:t>Ambos documentan ya el bucle completo: la seccion Monitoring Pipeline, las cuatro preguntas, por que es dificil de disparar, el backtest, y las decisiones arquitectonicas nuevas (Postgres en vez del topico de Kafka, estadisticos implementados en vez de importados, CronJob en vez de motor de workflows, deteccion sin reentrenamiento automatico, identidad IAM separada para batch).</w:t>
+      </w:r>
+    </w:p>
+    <w:p>
+      <w:pPr>
+        <w:pStyle w:val="ListBullet"/>
+      </w:pPr>
+      <w:r>
+        <w:t>Hallazgo de esta iteracion: un train/serve skew que nadie habia notado</w:t>
+      </w:r>
+    </w:p>
+    <w:p>
+      <w:r>
+        <w:t>El primer informe de drift real saco a la luz que `company` y `agent` son nulos en la mayoria de las filas de entrenamiento pero tienen 0.0 por defecto en el esquema de peticion de la API: un cliente que los omite envia un valor que el modelo nunca vio entrenar. El monitor lo reporta como `missing 94% -&gt; 0%` explicitamente, en vez de dejar un PSI de 5.6 sin explicacion. Es exactamente el tipo de defecto silencioso que justifica tener el monitor.</w:t>
       </w:r>
     </w:p>
     <w:sectPr>

</xml_diff>

<commit_message>
docs: update execution guide with Section 4/5 remediation
Section 3 no longer describes train.py auto-aliasing (it now only
registers + gates; promote_model.py moved the alias). Section 16's
account-ID editing instructions were removed - the ID is now a masked
CI/CD variable, not a literal in .gitlab-ci.yml. Section 29's "never
retrains" claim reconciled with mitigation.py's bounded auto-retrain.

New Section 31 documents the full remediation: promote_model.py's
canary/shadow gate and rollback, the real MSK broker + stream_consumer.py,
mitigation.py's cooldown/ceiling, the Section 1 fixes not yet reflected
here (train/test leakage, namespace, resource limits, mlflow/dashboard
replicas+PDB, masked account ID), and the local-first Kafka/Makefile
additions.

Co-Authored-By: Claude Sonnet 5 <noreply@anthropic.com>
</commit_message>
<xml_diff>
--- a/GUIA_EJECUCION_PROYECTO 610.docx
+++ b/GUIA_EJECUCION_PROYECTO 610.docx
@@ -420,6 +420,11 @@
           <w:sz w:val="21"/>
         </w:rPr>
         <w:t>29. El bucle de monitoreo de drift (local y en producción)</w:t>
+      </w:r>
+    </w:p>
+    <w:p>
+      <w:r>
+        <w:t>31. Remediacion senior post-auditoria (07/09/2026): streaming real, mitigacion automatica acotada, promocion canary/shadow, y validacion local-first</w:t>
       </w:r>
     </w:p>
     <w:p>
@@ -1578,16 +1583,7 @@
         <w:ind w:left="340"/>
       </w:pPr>
       <w:r>
-        <w:rPr>
-          <w:sz w:val="22"/>
-        </w:rPr>
-        <w:t xml:space="preserve">☐  </w:t>
-      </w:r>
-      <w:r>
-        <w:rPr>
-          <w:sz w:val="21"/>
-        </w:rPr>
-        <w:t>En la salida de logs (JSON, vía structlog) aparecen los eventos `optuna_tuning_finished`, `run_logged` y `model_version_aliased` con `quality_gate=passed`.</w:t>
+        <w:t>En la salida de logs (JSON, via structlog) aparecen los eventos `optuna_tuning_finished`, `run_logged` y `model_version_registered` con `quality_gate=passed` (YA NO `model_version_aliased`: desde la remediacion de la Seccion 31, train.py solo registra la version y aplica el quality gate absoluto -- mover el alias 'staging' es responsabilidad de un paso separado, `python -m src.promote_model --run-id &lt;id&gt;` o `make promote`, que compara contra lo que ya esta sirviendo antes de promover. Ver Seccion 31.1).</w:t>
       </w:r>
     </w:p>
     <w:p>
@@ -4850,12 +4846,39 @@
         <w:spacing w:after="120"/>
       </w:pPr>
       <w:r>
+        <w:t>Desde la remediacion de la Seccion 31, el Account ID YA NO se edita en este archivo: .gitlab-ci.yml referencia $AWS_ACCOUNT_ID (una variable de proyecto protegida/enmascarada), nunca un literal. Los tres pasos de esta seccion (editar AWS_ROLE_ARN, ECR_REGISTRY en build-push-ecr, ECR_REGISTRY en gitops-release) ya no aplican -- en su lugar, configura la variable UNA sola vez en GitLab: Settings &gt; CI/CD &gt; Variables &gt; New variable, key AWS_ACCOUNT_ID, valor tu Account ID de 12 digitos, marcada Protected y Masked.</w:t>
+      </w:r>
+    </w:p>
+    <w:p>
+      <w:pPr>
+        <w:spacing w:after="160"/>
+      </w:pPr>
+    </w:p>
+    <w:p>
+      <w:pPr>
+        <w:pStyle w:val="Heading1"/>
+        <w:spacing w:before="440" w:after="200"/>
+      </w:pPr>
+      <w:r>
+        <w:rPr>
+          <w:b/>
+          <w:color w:val="0B5CAD"/>
+          <w:sz w:val="32"/>
+        </w:rPr>
+        <w:t>17. Bootstrap de ArgoCD (paso manual único)</w:t>
+      </w:r>
+    </w:p>
+    <w:p>
+      <w:pPr>
+        <w:spacing w:after="120"/>
+      </w:pPr>
+      <w:r>
         <w:rPr>
           <w:b w:val="0"/>
           <w:i w:val="0"/>
           <w:sz w:val="21"/>
         </w:rPr>
-        <w:t>El archivo trae, a modo de ejemplo, el Account ID del entorno donde se desarrolló el proyecto (040175285118). Hay que reemplazarlo por el tuyo en dos sitios.</w:t>
+        <w:t>Terraform ya instalo ArgoCD dentro del cluster (Seccion 11), pero ArgoCD todavia no sabe que repositorio vigilar ni tiene credenciales para clonarlo. Este es el unico punto de todo el proceso donde se usa `kubectl apply` directo, y son TRES manifiestos, no uno: ver la Seccion 26 para la secuencia exacta y por que ese orden es obligatorio.</w:t>
       </w:r>
     </w:p>
     <w:p>
@@ -4867,7 +4890,7 @@
         <w:rPr>
           <w:sz w:val="21"/>
         </w:rPr>
-        <w:t>Reemplazar `AWS_ROLE_ARN` (al inicio del archivo, bloque `variables:`)</w:t>
+        <w:t>Editar gitops/argocd/application.yaml</w:t>
       </w:r>
     </w:p>
     <w:p>
@@ -4881,7 +4904,7 @@
           <w:color w:val="555555"/>
           <w:sz w:val="19"/>
         </w:rPr>
-        <w:t>Usar el ARN real del rol de CI anotado en la Sección 11. Desde la segunda ejecución el rol lleva el prefijo del proyecto para no colisionar con otro proyecto de la misma cuenta (Sección 28), así que el formato es arn:aws:iam::&lt;ACCOUNT_ID&gt;:role/hotel-mlops-gitlab-ci, no el antiguo GitLabCIRole.</w:t>
+        <w:t>Reemplazar `repoURL: https://gitlab.com/CHANGE_ME/hotel-mlops.git` con la URL real de tu proyecto de GitLab.</w:t>
       </w:r>
     </w:p>
     <w:p>
@@ -4893,73 +4916,7 @@
         <w:rPr>
           <w:sz w:val="21"/>
         </w:rPr>
-        <w:t>Reemplazar el Account ID dentro del job `build-push-ecr`</w:t>
-      </w:r>
-    </w:p>
-    <w:p>
-      <w:pPr>
-        <w:spacing w:after="120"/>
-        <w:ind w:left="624"/>
-      </w:pPr>
-      <w:r>
-        <w:rPr>
-          <w:i/>
-          <w:color w:val="555555"/>
-          <w:sz w:val="19"/>
-        </w:rPr>
-        <w:t>En la línea `export ECR_REGISTRY="040175285118.dkr.ecr.$AWS_REGION.amazonaws.com"`.</w:t>
-      </w:r>
-    </w:p>
-    <w:p>
-      <w:pPr>
-        <w:pStyle w:val="ListNumber"/>
-        <w:spacing w:after="80"/>
-      </w:pPr>
-      <w:r>
-        <w:rPr>
-          <w:sz w:val="21"/>
-        </w:rPr>
-        <w:t>Reemplazar el Account ID dentro del job `gitops-release`</w:t>
-      </w:r>
-    </w:p>
-    <w:p>
-      <w:pPr>
-        <w:spacing w:after="120"/>
-        <w:ind w:left="624"/>
-      </w:pPr>
-      <w:r>
-        <w:rPr>
-          <w:i/>
-          <w:color w:val="555555"/>
-          <w:sz w:val="19"/>
-        </w:rPr>
-        <w:t>Misma línea de `ECR_REGISTRY`, en ese segundo job.</w:t>
-      </w:r>
-    </w:p>
-    <w:p>
-      <w:pPr>
-        <w:spacing w:after="120"/>
-        <w:ind w:left="624"/>
-      </w:pPr>
-      <w:r>
-        <w:rPr>
-          <w:i/>
-          <w:color w:val="555555"/>
-          <w:sz w:val="19"/>
-        </w:rPr>
-        <w:t>No hace falta tocar nada más: `build-push-ecr` construye y sube CUATRO imágenes (api, dashboard, mlflow y jobs, esta última desde Dockerfile.jobs) y `gitops-release` escribe los cuatro tags con `kustomize edit set image`. El repositorio ECR hotel-mlops-jobs lo crea Terraform junto a los otros tres.</w:t>
-      </w:r>
-    </w:p>
-    <w:p>
-      <w:pPr>
-        <w:pStyle w:val="ListNumber"/>
-        <w:spacing w:after="80"/>
-      </w:pPr>
-      <w:r>
-        <w:rPr>
-          <w:sz w:val="21"/>
-        </w:rPr>
-        <w:t>Confirmar y subir el cambio a main:</w:t>
+        <w:t>Aplicar el manifiesto una única vez:</w:t>
       </w:r>
     </w:p>
     <w:p>
@@ -4974,7 +4931,24 @@
           <w:color w:val="1A1A1A"/>
           <w:sz w:val="19"/>
         </w:rPr>
-        <w:t>git add .gitlab-ci.yml</w:t>
+        <w:t>kubectl apply -f gitops/argocd/application.yaml</w:t>
+      </w:r>
+    </w:p>
+    <w:p>
+      <w:pPr>
+        <w:spacing w:after="160"/>
+      </w:pPr>
+    </w:p>
+    <w:p>
+      <w:pPr>
+        <w:pStyle w:val="ListNumber"/>
+        <w:spacing w:after="80"/>
+      </w:pPr>
+      <w:r>
+        <w:rPr>
+          <w:sz w:val="21"/>
+        </w:rPr>
+        <w:t>Verificar que ArgoCD registró la aplicación:</w:t>
       </w:r>
     </w:p>
     <w:p>
@@ -4989,7 +4963,24 @@
           <w:color w:val="1A1A1A"/>
           <w:sz w:val="19"/>
         </w:rPr>
-        <w:t>git commit -m "chore: use this account's IAM role ARN and ECR registry"</w:t>
+        <w:t>kubectl get applications -n argocd</w:t>
+      </w:r>
+    </w:p>
+    <w:p>
+      <w:pPr>
+        <w:spacing w:after="160"/>
+      </w:pPr>
+    </w:p>
+    <w:p>
+      <w:pPr>
+        <w:pStyle w:val="ListNumber"/>
+        <w:spacing w:after="80"/>
+      </w:pPr>
+      <w:r>
+        <w:rPr>
+          <w:sz w:val="21"/>
+        </w:rPr>
+        <w:t>Confirmar y subir el cambio también:</w:t>
       </w:r>
     </w:p>
     <w:p>
@@ -5004,6 +4995,36 @@
           <w:color w:val="1A1A1A"/>
           <w:sz w:val="19"/>
         </w:rPr>
+        <w:t>git add gitops/argocd/application.yaml</w:t>
+      </w:r>
+    </w:p>
+    <w:p>
+      <w:pPr>
+        <w:spacing w:after="0" w:before="0"/>
+        <w:ind w:left="170"/>
+        <w:shd w:val="clear" w:color="auto" w:fill="EDEFF2"/>
+      </w:pPr>
+      <w:r>
+        <w:rPr>
+          <w:rFonts w:ascii="Consolas" w:hAnsi="Consolas"/>
+          <w:color w:val="1A1A1A"/>
+          <w:sz w:val="19"/>
+        </w:rPr>
+        <w:t>git commit -m "chore: point ArgoCD Application at the real GitLab repo"</w:t>
+      </w:r>
+    </w:p>
+    <w:p>
+      <w:pPr>
+        <w:spacing w:after="0" w:before="0"/>
+        <w:ind w:left="170"/>
+        <w:shd w:val="clear" w:color="auto" w:fill="EDEFF2"/>
+      </w:pPr>
+      <w:r>
+        <w:rPr>
+          <w:rFonts w:ascii="Consolas" w:hAnsi="Consolas"/>
+          <w:color w:val="1A1A1A"/>
+          <w:sz w:val="19"/>
+        </w:rPr>
         <w:t>git push gitlab main</w:t>
       </w:r>
     </w:p>
@@ -5011,6 +5032,25 @@
       <w:pPr>
         <w:spacing w:after="160"/>
       </w:pPr>
+    </w:p>
+    <w:p>
+      <w:pPr>
+        <w:pStyle w:val="ListBullet"/>
+        <w:spacing w:after="80"/>
+        <w:ind w:left="340"/>
+      </w:pPr>
+      <w:r>
+        <w:rPr>
+          <w:sz w:val="22"/>
+        </w:rPr>
+        <w:t xml:space="preserve">☐  </w:t>
+      </w:r>
+      <w:r>
+        <w:rPr>
+          <w:sz w:val="21"/>
+        </w:rPr>
+        <w:t>Aparece la aplicación `hotel-mlops-production` al listar `kubectl get applications -n argocd`.</w:t>
+      </w:r>
     </w:p>
     <w:p>
       <w:pPr>
@@ -5023,173 +5063,16 @@
           <w:color w:val="0B5CAD"/>
           <w:sz w:val="32"/>
         </w:rPr>
-        <w:t>17. Bootstrap de ArgoCD (paso manual único)</w:t>
-      </w:r>
-    </w:p>
-    <w:p>
-      <w:pPr>
-        <w:spacing w:after="120"/>
-      </w:pPr>
-      <w:r>
-        <w:rPr>
-          <w:b w:val="0"/>
-          <w:i w:val="0"/>
-          <w:sz w:val="21"/>
-        </w:rPr>
-        <w:t>Terraform ya instalo ArgoCD dentro del cluster (Seccion 11), pero ArgoCD todavia no sabe que repositorio vigilar ni tiene credenciales para clonarlo. Este es el unico punto de todo el proceso donde se usa `kubectl apply` directo, y son TRES manifiestos, no uno: ver la Seccion 26 para la secuencia exacta y por que ese orden es obligatorio.</w:t>
-      </w:r>
-    </w:p>
-    <w:p>
-      <w:pPr>
-        <w:pStyle w:val="ListNumber"/>
-        <w:spacing w:after="80"/>
-      </w:pPr>
-      <w:r>
-        <w:rPr>
-          <w:sz w:val="21"/>
-        </w:rPr>
-        <w:t>Editar gitops/argocd/application.yaml</w:t>
-      </w:r>
-    </w:p>
-    <w:p>
-      <w:pPr>
-        <w:spacing w:after="120"/>
-        <w:ind w:left="624"/>
-      </w:pPr>
-      <w:r>
-        <w:rPr>
-          <w:i/>
-          <w:color w:val="555555"/>
-          <w:sz w:val="19"/>
-        </w:rPr>
-        <w:t>Reemplazar `repoURL: https://gitlab.com/CHANGE_ME/hotel-mlops.git` con la URL real de tu proyecto de GitLab.</w:t>
-      </w:r>
-    </w:p>
-    <w:p>
-      <w:pPr>
-        <w:pStyle w:val="ListNumber"/>
-        <w:spacing w:after="80"/>
-      </w:pPr>
-      <w:r>
-        <w:rPr>
-          <w:sz w:val="21"/>
-        </w:rPr>
-        <w:t>Aplicar el manifiesto una única vez:</w:t>
-      </w:r>
-    </w:p>
-    <w:p>
-      <w:pPr>
-        <w:spacing w:after="0" w:before="0"/>
-        <w:ind w:left="170"/>
-        <w:shd w:val="clear" w:color="auto" w:fill="EDEFF2"/>
-      </w:pPr>
-      <w:r>
-        <w:rPr>
-          <w:rFonts w:ascii="Consolas" w:hAnsi="Consolas"/>
-          <w:color w:val="1A1A1A"/>
-          <w:sz w:val="19"/>
-        </w:rPr>
-        <w:t>kubectl apply -f gitops/argocd/application.yaml</w:t>
-      </w:r>
-    </w:p>
-    <w:p>
-      <w:pPr>
-        <w:spacing w:after="160"/>
-      </w:pPr>
-    </w:p>
-    <w:p>
-      <w:pPr>
-        <w:pStyle w:val="ListNumber"/>
-        <w:spacing w:after="80"/>
-      </w:pPr>
-      <w:r>
-        <w:rPr>
-          <w:sz w:val="21"/>
-        </w:rPr>
-        <w:t>Verificar que ArgoCD registró la aplicación:</w:t>
-      </w:r>
-    </w:p>
-    <w:p>
-      <w:pPr>
-        <w:spacing w:after="0" w:before="0"/>
-        <w:ind w:left="170"/>
-        <w:shd w:val="clear" w:color="auto" w:fill="EDEFF2"/>
-      </w:pPr>
-      <w:r>
-        <w:rPr>
-          <w:rFonts w:ascii="Consolas" w:hAnsi="Consolas"/>
-          <w:color w:val="1A1A1A"/>
-          <w:sz w:val="19"/>
-        </w:rPr>
-        <w:t>kubectl get applications -n argocd</w:t>
-      </w:r>
-    </w:p>
-    <w:p>
-      <w:pPr>
-        <w:spacing w:after="160"/>
-      </w:pPr>
-    </w:p>
-    <w:p>
-      <w:pPr>
-        <w:pStyle w:val="ListNumber"/>
-        <w:spacing w:after="80"/>
-      </w:pPr>
-      <w:r>
-        <w:rPr>
-          <w:sz w:val="21"/>
-        </w:rPr>
-        <w:t>Confirmar y subir el cambio también:</w:t>
-      </w:r>
-    </w:p>
-    <w:p>
-      <w:pPr>
-        <w:spacing w:after="0" w:before="0"/>
-        <w:ind w:left="170"/>
-        <w:shd w:val="clear" w:color="auto" w:fill="EDEFF2"/>
-      </w:pPr>
-      <w:r>
-        <w:rPr>
-          <w:rFonts w:ascii="Consolas" w:hAnsi="Consolas"/>
-          <w:color w:val="1A1A1A"/>
-          <w:sz w:val="19"/>
-        </w:rPr>
-        <w:t>git add gitops/argocd/application.yaml</w:t>
-      </w:r>
-    </w:p>
-    <w:p>
-      <w:pPr>
-        <w:spacing w:after="0" w:before="0"/>
-        <w:ind w:left="170"/>
-        <w:shd w:val="clear" w:color="auto" w:fill="EDEFF2"/>
-      </w:pPr>
-      <w:r>
-        <w:rPr>
-          <w:rFonts w:ascii="Consolas" w:hAnsi="Consolas"/>
-          <w:color w:val="1A1A1A"/>
-          <w:sz w:val="19"/>
-        </w:rPr>
-        <w:t>git commit -m "chore: point ArgoCD Application at the real GitLab repo"</w:t>
-      </w:r>
-    </w:p>
-    <w:p>
-      <w:pPr>
-        <w:spacing w:after="0" w:before="0"/>
-        <w:ind w:left="170"/>
-        <w:shd w:val="clear" w:color="auto" w:fill="EDEFF2"/>
-      </w:pPr>
-      <w:r>
-        <w:rPr>
-          <w:rFonts w:ascii="Consolas" w:hAnsi="Consolas"/>
-          <w:color w:val="1A1A1A"/>
-          <w:sz w:val="19"/>
-        </w:rPr>
-        <w:t>git push gitlab main</w:t>
-      </w:r>
-    </w:p>
-    <w:p>
-      <w:pPr>
-        <w:spacing w:after="160"/>
-      </w:pPr>
+        <w:t>18. Disparar y verificar el primer pipeline completo de CI/CD</w:t>
+      </w:r>
+    </w:p>
+    <w:p>
+      <w:pPr>
+        <w:pStyle w:val="ListBullet"/>
+      </w:pPr>
+      <w:r>
+        <w:t>☐  El runner local esta registrado y corriendo (make runner-start, Seccion 6) — todos los jobs llevan tags: ["local-hardware"], asi que sin esto el pipeline queda en pending para siempre.</w:t>
+      </w:r>
     </w:p>
     <w:p>
       <w:pPr>
@@ -5198,57 +5081,7 @@
         <w:ind w:left="340"/>
       </w:pPr>
       <w:r>
-        <w:rPr>
-          <w:sz w:val="22"/>
-        </w:rPr>
-        <w:t xml:space="preserve">☐  </w:t>
-      </w:r>
-      <w:r>
-        <w:rPr>
-          <w:sz w:val="21"/>
-        </w:rPr>
-        <w:t>Aparece la aplicación `hotel-mlops-production` al listar `kubectl get applications -n argocd`.</w:t>
-      </w:r>
-    </w:p>
-    <w:p>
-      <w:pPr>
-        <w:pStyle w:val="Heading1"/>
-        <w:spacing w:before="440" w:after="200"/>
-      </w:pPr>
-      <w:r>
-        <w:rPr>
-          <w:b/>
-          <w:color w:val="0B5CAD"/>
-          <w:sz w:val="32"/>
-        </w:rPr>
-        <w:t>18. Disparar y verificar el primer pipeline completo de CI/CD</w:t>
-      </w:r>
-    </w:p>
-    <w:p>
-      <w:pPr>
-        <w:pStyle w:val="ListBullet"/>
-      </w:pPr>
-      <w:r>
-        <w:t>☐  El runner local esta registrado y corriendo (make runner-start, Seccion 6) — todos los jobs llevan tags: ["local-hardware"], asi que sin esto el pipeline queda en pending para siempre.</w:t>
-      </w:r>
-    </w:p>
-    <w:p>
-      <w:pPr>
-        <w:pStyle w:val="ListBullet"/>
-        <w:spacing w:after="80"/>
-        <w:ind w:left="340"/>
-      </w:pPr>
-      <w:r>
-        <w:rPr>
-          <w:sz w:val="22"/>
-        </w:rPr>
-        <w:t xml:space="preserve">☐  </w:t>
-      </w:r>
-      <w:r>
-        <w:rPr>
-          <w:sz w:val="21"/>
-        </w:rPr>
-        <w:t>Ya se subieron a `main` en GitLab TODOS los cambios de las secciones 13, 14, 16 y 17.</w:t>
+        <w:t>☐  Ya se subieron a `main` en GitLab TODOS los cambios de las secciones 13, 14 y 17 -- la Seccion 16 ya no requiere un commit propio (el Account ID se configura como variable de proyecto en GitLab, ver Seccion 16).</w:t>
       </w:r>
     </w:p>
     <w:p>
@@ -8638,12 +8471,7 @@
         <w:ind w:left="113"/>
       </w:pPr>
       <w:r>
-        <w:rPr>
-          <w:b/>
-          <w:color w:val="B46A00"/>
-          <w:sz w:val="20"/>
-        </w:rPr>
-        <w:t>El monitor NUNCA reentrena ni promueve nada</w:t>
+        <w:t>El monitor puede disparar un reentrenamiento acotado; sigue sin promover nada el mismo</w:t>
       </w:r>
     </w:p>
     <w:p>
@@ -8659,11 +8487,7 @@
         <w:ind w:left="113"/>
       </w:pPr>
       <w:r>
-        <w:rPr>
-          <w:color w:val="5A3D00"/>
-          <w:sz w:val="19"/>
-        </w:rPr>
-        <w:t>Cerrar el bucle automáticamente — salta el drift, se reentrena, se mueve el alias — es la demo que todo el mundo quiere y el diseño que nadie debería desplegar: permite que un incidente de calidad de datos aguas arriba promueva un modelo entrenado sobre ese incidente, sin ningún humano en medio. La autoridad del job termina en registrar el hallazgo y fallar ruidosamente. Reentrenar es una decisión (Sección 21); esto es la evidencia para tomarla.</w:t>
+        <w:t>Desde la Seccion 31, un ALERT confirmado (batch o del nuevo stream_consumer.py) llega a mitigation.py, que puede lanzar un reentrenamiento via la API de Pipeline Trigger de GitLab -- acotado por cooldown, un techo de reentrenamientos automaticos por ventana movil, y una llamada HTTP con timeout, nunca un bucle sin limite. Lo que sigue sin poder hacer es mover el alias: eso es promote_model.py (Seccion 31.1), gated en una comparacion canary contra la version que ya esta sirviendo. La preocupacion original de este parrafo -- un incidente de calidad de datos aguas arriba promoviendo un modelo entrenado sobre ese incidente, sin ningun humano en medio -- sigue siendo estructuralmente imposible; se resuelve una capa mas abajo, no evitando reentrenar por completo. Ver Seccion 31 para el detalle completo.</w:t>
       </w:r>
     </w:p>
     <w:p>
@@ -9152,6 +8976,132 @@
     <w:p>
       <w:r>
         <w:t>El primer informe de drift real saco a la luz que `company` y `agent` son nulos en la mayoria de las filas de entrenamiento pero tienen 0.0 por defecto en el esquema de peticion de la API: un cliente que los omite envia un valor que el modelo nunca vio entrenar. El monitor lo reporta como `missing 94% -&gt; 0%` explicitamente, en vez de dejar un PSI de 5.6 sin explicacion. Es exactamente el tipo de defecto silencioso que justifica tener el monitor.</w:t>
+      </w:r>
+    </w:p>
+    <w:p>
+      <w:pPr>
+        <w:pStyle w:val="Heading1"/>
+      </w:pPr>
+      <w:r>
+        <w:t>31. Remediacion senior post-auditoria (07/09/2026): streaming real, mitigacion automatica acotada, promocion canary/shadow, y validacion local-first</w:t>
+      </w:r>
+    </w:p>
+    <w:p>
+      <w:r>
+        <w:t>Que se corrigio y que se agrego tras una auditoria de nivel senior/lead sobre el estado del repositorio descrito en las Secciones 1-30. Mismo criterio que esas secciones: causa raiz, no solo el sintoma. Todo esta commiteado.</w:t>
+      </w:r>
+    </w:p>
+    <w:p>
+      <w:pPr>
+        <w:pStyle w:val="Heading2"/>
+      </w:pPr>
+      <w:r>
+        <w:t>31.1 — Promocion: el gate canary/shadow que faltaba</w:t>
+      </w:r>
+    </w:p>
+    <w:p>
+      <w:r>
+        <w:t>train.py ya no mueve el alias 'staging' -- solo registra la version y aplica el quality gate absoluto (min_f1_threshold). La promocion es ahora un paso separado, core_ml/src/promote_model.py (`python -m src.promote_model --run-id &lt;id&gt;` o `make promote`): compara el candidato contra la version actualmente aliasada (ambas metricas leidas de su propio reference_profile.json, el mismo estandar al que el monitor de concept drift ya somete a un modelo en produccion), dentro de `model.canary_tolerance` (config.yaml -- un numero negativo pequeno, no cero: exigir mejora estricta en cada reentrenamiento automatico rechazaria un modelo que recupero la mayor parte, pero no toda, una regresion real). Si no hay ninguna version aliasada todavia, promueve directo (bootstrap). Cada promocion etiqueta la version con `promoted_from_version`; `make promote-rollback` (`python -m src.promote_model --rollback`) mueve el alias de vuelta exactamente un paso -- deliberadamente uno, no un recorrido completo del historial.</w:t>
+      </w:r>
+    </w:p>
+    <w:p>
+      <w:pPr>
+        <w:pStyle w:val="Heading2"/>
+      </w:pPr>
+      <w:r>
+        <w:t>31.2 — Streaming real: Amazon MSK + stream_consumer.py</w:t>
+      </w:r>
+    </w:p>
+    <w:p>
+      <w:r>
+        <w:t>api/main.py ya publicaba eventos de prediccion bien formados a Kafka (`_publish_prediction_event`, gated en KAFKA_BOOTSTRAP_SERVERS) pero ningun .tf provisionaba el broker: era un no-op permanente en produccion. terraform/msk.tf provisiona ahora un cluster MSK real (2 brokers, kafka.t3.small, TLS obligatorio, cifrado en reposo con la clave gestionada por AWS -- misma postura ya adoptada para S3, ver .trivyignore AWS-0132). KAFKA_SECURITY_PROTOCOL (nuevo) distingue PLAINTEXT local de SSL en produccion. core_ml/src/monitoring/stream_consumer.py (nuevo, Deployment) consume ese topico y llama al MISMO run_monitor() que usa el CronJob diario, sobre una ventana de ~15 minutos en vez de 24 horas, en su propio experimento de MLflow para que su histeresis nunca se mezcle con la del job diario. Concept drift no recibe trato especial: con tan pocos minutos casi nunca hay suficientes etiquetas reconciliadas, y el monitor reporta SKIPPED correctamente -- la respuesta honesta, no una limitacion a esconder.</w:t>
+      </w:r>
+    </w:p>
+    <w:p>
+      <w:pPr>
+        <w:pStyle w:val="Heading2"/>
+      </w:pPr>
+      <w:r>
+        <w:t>31.3 — Mitigacion automatica acotada: core_ml/src/monitoring/mitigation.py</w:t>
+      </w:r>
+    </w:p>
+    <w:p>
+      <w:r>
+        <w:t>Un ALERT confirmado (batch o stream) puede disparar un reentrenamiento via la API de Pipeline Trigger de GitLab, acotado por tres mecanismos: (1) cooldown_hours -- un disparo por incidente, no uno por monitor; (2) un techo duro (max_auto_retrains por max_auto_retrains_window_days) -- una fuente de drift que un reentrenamiento no puede arreglar llega a un humano, no reintenta para siempre; (3) la llamada HTTP en si tiene timeout fijo y nunca se reintenta en bucle. El estado vive en una tabla nueva, monitoring.mitigation_events, en el mismo Postgres que ya usa el log de predicciones. El token de Pipeline Trigger de GitLab (terraform/secrets.tf) es sensible y sin default -- GitLab lo emite (Settings &gt; CI/CD &gt; Pipeline triggers), Terraform no puede generarlo.</w:t>
+      </w:r>
+    </w:p>
+    <w:p>
+      <w:pPr>
+        <w:pStyle w:val="Heading2"/>
+      </w:pPr>
+      <w:r>
+        <w:t>31.4 — Correcciones de metodologia y de infraestructura (Secciones 1-30)</w:t>
+      </w:r>
+    </w:p>
+    <w:p>
+      <w:r>
+        <w:t>☑  Leakage de tuning en train.py: Optuna ya no evalua contra el test set. Split 3-way real (config.yaml: test_size + validation_size); Optuna optimiza sobre X_val, el pipeline final se reajusta sobre train+val, y el test set se toca UNA sola vez, al final, para el quality gate y la linea base de monitoreo.</w:t>
+      </w:r>
+    </w:p>
+    <w:p>
+      <w:r>
+        <w:t>☑  Namespace: todos los recursos de kubernetes/base/ viven ahora en el namespace 'hotel-mlops' explicito (namespace.yaml nuevo, declarado como recurso versionado), no en 'default'.</w:t>
+      </w:r>
+    </w:p>
+    <w:p>
+      <w:r>
+        <w:t>☑  resources: (requests/limits) agregados a api.yaml, mlflow.yaml y dashboard.yaml -- antes solo el CronJob de drift los tenia, inconsistencia que delataba que una parte se penso bien y el resto se dejo a medias.</w:t>
+      </w:r>
+    </w:p>
+    <w:p>
+      <w:r>
+        <w:t>☑  mlflow y dashboard pasaron de replicas: 1 (SPOF) a replicas: 2, con un PodDisruptionBudget (minAvailable: 1) cada uno.</w:t>
+      </w:r>
+    </w:p>
+    <w:p>
+      <w:r>
+        <w:t>☑  El Account ID de AWS, hardcodeado en texto plano tres veces en .gitlab-ci.yml, es ahora la variable de proyecto protegida/enmascarada $AWS_ACCOUNT_ID (ver Seccion 16, ya actualizada).</w:t>
+      </w:r>
+    </w:p>
+    <w:p>
+      <w:pPr>
+        <w:pStyle w:val="Heading2"/>
+      </w:pPr>
+      <w:r>
+        <w:t>31.5 — Local-first: validar todo sin tocar AWS real</w:t>
+      </w:r>
+    </w:p>
+    <w:p>
+      <w:r>
+        <w:t>El unico vacio real que dejo el streaming de MSK: stream_consumer.py solo podia ejercitarse contra el Kafka real de terraform/msk.tf. Corregido reutilizando el Kafka de este mismo docker-compose.yml (ya existia para desarrollo local) -- Kafka es un protocolo abierto, el mismo cliente habla indistintamente con el broker local o con MSK real, sin cambios de codigo. Makefile: `make stream-up` (levanta stream-consumer contra el stack local, perfil 'jobs') y `make stream-logs`. Sin GITLAB_TRIGGER_TOKEN configurado localmente, mitigation.py falla su llamada HTTP, la captura, y la registra como 'failed' -- el comportamiento correcto para probar deteccion de drift en local sin disparar jamas un pipeline real de GitLab.</w:t>
+      </w:r>
+    </w:p>
+    <w:p>
+      <w:pPr>
+        <w:pStyle w:val="Heading2"/>
+      </w:pPr>
+      <w:r>
+        <w:t>Comandos nuevos de referencia rapida (Anexo B)</w:t>
+      </w:r>
+    </w:p>
+    <w:p>
+      <w:r>
+        <w:t>make promote               # canary-compara la ultima corrida contra produccion y promueve si corresponde</w:t>
+      </w:r>
+    </w:p>
+    <w:p>
+      <w:r>
+        <w:t>make promote-rollback      # mueve el alias de vuelta exactamente un paso</w:t>
+      </w:r>
+    </w:p>
+    <w:p>
+      <w:r>
+        <w:t>make stream-up             # levanta stream-consumer contra el Kafka local (perfil jobs)</w:t>
+      </w:r>
+    </w:p>
+    <w:p>
+      <w:r>
+        <w:t>make stream-logs           # sigue los logs del consumidor de streaming</w:t>
       </w:r>
     </w:p>
     <w:sectPr>

</xml_diff>